<commit_message>
Fix SECZIM prudential template double-brace delimiters for docxtemplater.
Co-authored-by: Cursor <cursoragent@cursor.com>
</commit_message>
<xml_diff>
--- a/storage/report-templates/investment-ops/seczim-prudential-return-pack.docx
+++ b/storage/report-templates/investment-ops/seczim-prudential-return-pack.docx
@@ -61,7 +61,7 @@
                 <w:sz w:val="24"/>
                 <w:highlight w:val="yellow"/>
               </w:rPr>
-              <w:t>{{ASSET_MANAGER_OR_LICENSED_ENTITY_NAME}}</w:t>
+              <w:t>{ASSET_MANAGER_OR_LICENSED_ENTITY_NAME}</w:t>
             </w:r>
             <w:r>
               <w:br/>
@@ -84,7 +84,7 @@
                 <w:sz w:val="16"/>
                 <w:highlight w:val="yellow"/>
               </w:rPr>
-              <w:t>{{REGISTERED_OFFICE_ADDRESS}}</w:t>
+              <w:t>{REGISTERED_OFFICE_ADDRESS}</w:t>
             </w:r>
             <w:r>
               <w:br/>
@@ -107,7 +107,7 @@
                 <w:sz w:val="16"/>
                 <w:highlight w:val="yellow"/>
               </w:rPr>
-              <w:t>{{SECZIM_LICENCE_NUMBER}}</w:t>
+              <w:t>{SECZIM_LICENCE_NUMBER}</w:t>
             </w:r>
             <w:r>
               <w:t xml:space="preserve"> | </w:t>
@@ -130,7 +130,7 @@
                 <w:sz w:val="16"/>
                 <w:highlight w:val="yellow"/>
               </w:rPr>
-              <w:t>{{COMPANY_REGISTRATION_NUMBER}}</w:t>
+              <w:t>{COMPANY_REGISTRATION_NUMBER}</w:t>
             </w:r>
             <w:r>
               <w:br/>
@@ -153,7 +153,7 @@
                 <w:sz w:val="16"/>
                 <w:highlight w:val="yellow"/>
               </w:rPr>
-              <w:t>{{OFFICIAL_EMAIL}}</w:t>
+              <w:t>{OFFICIAL_EMAIL}</w:t>
             </w:r>
             <w:r>
               <w:t xml:space="preserve"> | </w:t>
@@ -176,7 +176,7 @@
                 <w:sz w:val="16"/>
                 <w:highlight w:val="yellow"/>
               </w:rPr>
-              <w:t>{{TELEPHONE_NUMBER}}</w:t>
+              <w:t>{TELEPHONE_NUMBER}</w:t>
             </w:r>
           </w:p>
         </w:tc>
@@ -436,7 +436,7 @@
                 <w:sz w:val="16"/>
                 <w:highlight w:val="yellow"/>
               </w:rPr>
-              <w:t>{{REPORTING_PERIOD}}</w:t>
+              <w:t>{REPORTING_PERIOD}</w:t>
             </w:r>
           </w:p>
         </w:tc>
@@ -503,7 +503,7 @@
                 <w:sz w:val="16"/>
                 <w:highlight w:val="yellow"/>
               </w:rPr>
-              <w:t>{{QUARTER_END_DATE}}</w:t>
+              <w:t>{QUARTER_END_DATE}</w:t>
             </w:r>
           </w:p>
         </w:tc>
@@ -570,7 +570,7 @@
                 <w:sz w:val="16"/>
                 <w:highlight w:val="yellow"/>
               </w:rPr>
-              <w:t>{{SUBMISSION_DEADLINE}}</w:t>
+              <w:t>{SUBMISSION_DEADLINE}</w:t>
             </w:r>
           </w:p>
         </w:tc>
@@ -635,7 +635,7 @@
                 <w:sz w:val="16"/>
                 <w:highlight w:val="yellow"/>
               </w:rPr>
-              <w:t>{{COMPLIANCE_OFFICER_OR_BOARD}}</w:t>
+              <w:t>{COMPLIANCE_OFFICER_OR_BOARD}</w:t>
             </w:r>
           </w:p>
         </w:tc>
@@ -704,7 +704,7 @@
                 <w:sz w:val="16"/>
                 <w:highlight w:val="yellow"/>
               </w:rPr>
-              <w:t>{{REGULATORY_CATEGORY}}</w:t>
+              <w:t>{REGULATORY_CATEGORY}</w:t>
             </w:r>
           </w:p>
         </w:tc>
@@ -771,7 +771,7 @@
                 <w:sz w:val="16"/>
                 <w:highlight w:val="yellow"/>
               </w:rPr>
-              <w:t>{{DRAFT_APPROVED_SUBMITTED_ARCHIVED}}</w:t>
+              <w:t>{DRAFT_APPROVED_SUBMITTED_ARCHIVED}</w:t>
             </w:r>
           </w:p>
         </w:tc>
@@ -838,7 +838,7 @@
                 <w:sz w:val="16"/>
                 <w:highlight w:val="yellow"/>
               </w:rPr>
-              <w:t>{{REPORTING_RUN_ID}}</w:t>
+              <w:t>{REPORTING_RUN_ID}</w:t>
             </w:r>
           </w:p>
         </w:tc>
@@ -903,7 +903,7 @@
                 <w:sz w:val="16"/>
                 <w:highlight w:val="yellow"/>
               </w:rPr>
-              <w:t>{{VERSION_NUMBER}}</w:t>
+              <w:t>{VERSION_NUMBER}</w:t>
             </w:r>
           </w:p>
         </w:tc>
@@ -1114,7 +1114,7 @@
                 <w:color w:val="0B1220"/>
                 <w:sz w:val="16"/>
               </w:rPr>
-              <w:t>Yellow highlighted {{PLACEHOLDERS}}</w:t>
+              <w:t>Yellow highlighted {PLACEHOLDERS}</w:t>
             </w:r>
           </w:p>
         </w:tc>
@@ -1314,7 +1314,7 @@
           <w:sz w:val="18"/>
           <w:highlight w:val="yellow"/>
         </w:rPr>
-        <w:t>{{LICENSED_ENTITY_NAME}}</w:t>
+        <w:t>{LICENSED_ENTITY_NAME}</w:t>
       </w:r>
       <w:r>
         <w:rPr>
@@ -1585,7 +1585,7 @@
                 <w:sz w:val="15"/>
                 <w:highlight w:val="yellow"/>
               </w:rPr>
-              <w:t>{{ACCOUNTING_MODULE_AND_APPROVED_LEDGER}}</w:t>
+              <w:t>{ACCOUNTING_MODULE_AND_APPROVED_LEDGER}</w:t>
             </w:r>
           </w:p>
         </w:tc>
@@ -1619,7 +1619,7 @@
                 <w:sz w:val="15"/>
                 <w:highlight w:val="yellow"/>
               </w:rPr>
-              <w:t>{{COMPLETE_PENDING_EXCEPTION}}</w:t>
+              <w:t>{COMPLETE_PENDING_EXCEPTION}</w:t>
             </w:r>
           </w:p>
         </w:tc>
@@ -1720,7 +1720,7 @@
                 <w:sz w:val="15"/>
                 <w:highlight w:val="yellow"/>
               </w:rPr>
-              <w:t>{{MANAGEMENT_ACCOUNTS_FILE_REF}}</w:t>
+              <w:t>{MANAGEMENT_ACCOUNTS_FILE_REF}</w:t>
             </w:r>
           </w:p>
         </w:tc>
@@ -1753,7 +1753,7 @@
                 <w:sz w:val="15"/>
                 <w:highlight w:val="yellow"/>
               </w:rPr>
-              <w:t>{{COMPLETE_PENDING_EXCEPTION}}</w:t>
+              <w:t>{COMPLETE_PENDING_EXCEPTION}</w:t>
             </w:r>
           </w:p>
         </w:tc>
@@ -1857,7 +1857,7 @@
                 <w:sz w:val="15"/>
                 <w:highlight w:val="yellow"/>
               </w:rPr>
-              <w:t>{{STOCK_PRICE_COLLECTOR_VALUATION_MODULE}}</w:t>
+              <w:t>{STOCK_PRICE_COLLECTOR_VALUATION_MODULE}</w:t>
             </w:r>
           </w:p>
         </w:tc>
@@ -1891,7 +1891,7 @@
                 <w:sz w:val="15"/>
                 <w:highlight w:val="yellow"/>
               </w:rPr>
-              <w:t>{{COMPLETE_PENDING_EXCEPTION}}</w:t>
+              <w:t>{COMPLETE_PENDING_EXCEPTION}</w:t>
             </w:r>
           </w:p>
         </w:tc>
@@ -1992,7 +1992,7 @@
                 <w:sz w:val="15"/>
                 <w:highlight w:val="yellow"/>
               </w:rPr>
-              <w:t>{{CAPITAL_ADEQUACY_PACK_ID}}</w:t>
+              <w:t>{CAPITAL_ADEQUACY_PACK_ID}</w:t>
             </w:r>
           </w:p>
         </w:tc>
@@ -2025,7 +2025,7 @@
                 <w:sz w:val="15"/>
                 <w:highlight w:val="yellow"/>
               </w:rPr>
-              <w:t>{{COMPLETE_PENDING_EXCEPTION}}</w:t>
+              <w:t>{COMPLETE_PENDING_EXCEPTION}</w:t>
             </w:r>
           </w:p>
         </w:tc>
@@ -2129,7 +2129,7 @@
                 <w:sz w:val="15"/>
                 <w:highlight w:val="yellow"/>
               </w:rPr>
-              <w:t>{{AML_CFT_CPF_PACK_ID}}</w:t>
+              <w:t>{AML_CFT_CPF_PACK_ID}</w:t>
             </w:r>
           </w:p>
         </w:tc>
@@ -2163,7 +2163,7 @@
                 <w:sz w:val="15"/>
                 <w:highlight w:val="yellow"/>
               </w:rPr>
-              <w:t>{{COMPLETE_PENDING_EXCEPTION}}</w:t>
+              <w:t>{COMPLETE_PENDING_EXCEPTION}</w:t>
             </w:r>
           </w:p>
         </w:tc>
@@ -2264,7 +2264,7 @@
                 <w:sz w:val="15"/>
                 <w:highlight w:val="yellow"/>
               </w:rPr>
-              <w:t>{{REGULATORY_RETURNS_REGISTER}}</w:t>
+              <w:t>{REGULATORY_RETURNS_REGISTER}</w:t>
             </w:r>
           </w:p>
         </w:tc>
@@ -2297,7 +2297,7 @@
                 <w:sz w:val="15"/>
                 <w:highlight w:val="yellow"/>
               </w:rPr>
-              <w:t>{{OPEN_SUBMITTED_CLOSED}}</w:t>
+              <w:t>{OPEN_SUBMITTED_CLOSED}</w:t>
             </w:r>
           </w:p>
         </w:tc>
@@ -2540,7 +2540,7 @@
                 <w:sz w:val="16"/>
                 <w:highlight w:val="yellow"/>
               </w:rPr>
-              <w:t>{{LICENSED_ENTITY_NAME}}</w:t>
+              <w:t>{LICENSED_ENTITY_NAME}</w:t>
             </w:r>
           </w:p>
         </w:tc>
@@ -2607,7 +2607,7 @@
                 <w:sz w:val="16"/>
                 <w:highlight w:val="yellow"/>
               </w:rPr>
-              <w:t>{{SECZIM_LICENCE_NUMBER}}</w:t>
+              <w:t>{SECZIM_LICENCE_NUMBER}</w:t>
             </w:r>
           </w:p>
         </w:tc>
@@ -2674,7 +2674,7 @@
                 <w:sz w:val="16"/>
                 <w:highlight w:val="yellow"/>
               </w:rPr>
-              <w:t>{{PRUDENTIAL_FINANCIAL_RETURN}}</w:t>
+              <w:t>{PRUDENTIAL_FINANCIAL_RETURN}</w:t>
             </w:r>
           </w:p>
         </w:tc>
@@ -2739,7 +2739,7 @@
                 <w:sz w:val="16"/>
                 <w:highlight w:val="yellow"/>
               </w:rPr>
-              <w:t>{{REPORTING_QUARTER}}</w:t>
+              <w:t>{REPORTING_QUARTER}</w:t>
             </w:r>
           </w:p>
         </w:tc>
@@ -2808,7 +2808,7 @@
                 <w:sz w:val="16"/>
                 <w:highlight w:val="yellow"/>
               </w:rPr>
-              <w:t>{{FINANCIAL_YEAR}}</w:t>
+              <w:t>{FINANCIAL_YEAR}</w:t>
             </w:r>
           </w:p>
         </w:tc>
@@ -2875,7 +2875,7 @@
                 <w:sz w:val="16"/>
                 <w:highlight w:val="yellow"/>
               </w:rPr>
-              <w:t>{{BASE_CURRENCY}}</w:t>
+              <w:t>{BASE_CURRENCY}</w:t>
             </w:r>
           </w:p>
         </w:tc>
@@ -2942,7 +2942,7 @@
                 <w:sz w:val="16"/>
                 <w:highlight w:val="yellow"/>
               </w:rPr>
-              <w:t>{{CONSOLIDATION_CURRENCY}}</w:t>
+              <w:t>{CONSOLIDATION_CURRENCY}</w:t>
             </w:r>
           </w:p>
         </w:tc>
@@ -3007,7 +3007,7 @@
                 <w:sz w:val="16"/>
                 <w:highlight w:val="yellow"/>
               </w:rPr>
-              <w:t>{{SECZIM_TEMPLATE_VERSION}}</w:t>
+              <w:t>{SECZIM_TEMPLATE_VERSION}</w:t>
             </w:r>
           </w:p>
         </w:tc>
@@ -3076,7 +3076,7 @@
                 <w:sz w:val="16"/>
                 <w:highlight w:val="yellow"/>
               </w:rPr>
-              <w:t>{{PREPARER_NAME}}</w:t>
+              <w:t>{PREPARER_NAME}</w:t>
             </w:r>
           </w:p>
         </w:tc>
@@ -3143,7 +3143,7 @@
                 <w:sz w:val="16"/>
                 <w:highlight w:val="yellow"/>
               </w:rPr>
-              <w:t>{{COMPLIANCE_REVIEWER_NAME}}</w:t>
+              <w:t>{COMPLIANCE_REVIEWER_NAME}</w:t>
             </w:r>
           </w:p>
         </w:tc>
@@ -3210,7 +3210,7 @@
                 <w:sz w:val="16"/>
                 <w:highlight w:val="yellow"/>
               </w:rPr>
-              <w:t>{{AUTHORISED_OFFICER_NAME}}</w:t>
+              <w:t>{AUTHORISED_OFFICER_NAME}</w:t>
             </w:r>
           </w:p>
         </w:tc>
@@ -3275,7 +3275,7 @@
                 <w:sz w:val="16"/>
                 <w:highlight w:val="yellow"/>
               </w:rPr>
-              <w:t>{{REPORTING_RUN_ID}}</w:t>
+              <w:t>{REPORTING_RUN_ID}</w:t>
             </w:r>
           </w:p>
         </w:tc>
@@ -3676,7 +3676,7 @@
                 <w:sz w:val="14"/>
                 <w:highlight w:val="yellow"/>
               </w:rPr>
-              <w:t>{{OWNER}}</w:t>
+              <w:t>{OWNER}</w:t>
             </w:r>
           </w:p>
         </w:tc>
@@ -3710,7 +3710,7 @@
                 <w:sz w:val="14"/>
                 <w:highlight w:val="yellow"/>
               </w:rPr>
-              <w:t>{{FILE_REF}}</w:t>
+              <w:t>{FILE_REF}</w:t>
             </w:r>
           </w:p>
         </w:tc>
@@ -3744,7 +3744,7 @@
                 <w:sz w:val="14"/>
                 <w:highlight w:val="yellow"/>
               </w:rPr>
-              <w:t>{{STATUS}}</w:t>
+              <w:t>{STATUS}</w:t>
             </w:r>
           </w:p>
         </w:tc>
@@ -3778,7 +3778,7 @@
                 <w:sz w:val="14"/>
                 <w:highlight w:val="yellow"/>
               </w:rPr>
-              <w:t>{{COMMENT}}</w:t>
+              <w:t>{COMMENT}</w:t>
             </w:r>
           </w:p>
         </w:tc>
@@ -3879,7 +3879,7 @@
                 <w:sz w:val="14"/>
                 <w:highlight w:val="yellow"/>
               </w:rPr>
-              <w:t>{{OWNER}}</w:t>
+              <w:t>{OWNER}</w:t>
             </w:r>
           </w:p>
         </w:tc>
@@ -3912,7 +3912,7 @@
                 <w:sz w:val="14"/>
                 <w:highlight w:val="yellow"/>
               </w:rPr>
-              <w:t>{{FILE_REF}}</w:t>
+              <w:t>{FILE_REF}</w:t>
             </w:r>
           </w:p>
         </w:tc>
@@ -3945,7 +3945,7 @@
                 <w:sz w:val="14"/>
                 <w:highlight w:val="yellow"/>
               </w:rPr>
-              <w:t>{{STATUS}}</w:t>
+              <w:t>{STATUS}</w:t>
             </w:r>
           </w:p>
         </w:tc>
@@ -3978,7 +3978,7 @@
                 <w:sz w:val="14"/>
                 <w:highlight w:val="yellow"/>
               </w:rPr>
-              <w:t>{{COMMENT}}</w:t>
+              <w:t>{COMMENT}</w:t>
             </w:r>
           </w:p>
         </w:tc>
@@ -4082,7 +4082,7 @@
                 <w:sz w:val="14"/>
                 <w:highlight w:val="yellow"/>
               </w:rPr>
-              <w:t>{{OWNER}}</w:t>
+              <w:t>{OWNER}</w:t>
             </w:r>
           </w:p>
         </w:tc>
@@ -4116,7 +4116,7 @@
                 <w:sz w:val="14"/>
                 <w:highlight w:val="yellow"/>
               </w:rPr>
-              <w:t>{{FILE_REF}}</w:t>
+              <w:t>{FILE_REF}</w:t>
             </w:r>
           </w:p>
         </w:tc>
@@ -4150,7 +4150,7 @@
                 <w:sz w:val="14"/>
                 <w:highlight w:val="yellow"/>
               </w:rPr>
-              <w:t>{{STATUS}}</w:t>
+              <w:t>{STATUS}</w:t>
             </w:r>
           </w:p>
         </w:tc>
@@ -4184,7 +4184,7 @@
                 <w:sz w:val="14"/>
                 <w:highlight w:val="yellow"/>
               </w:rPr>
-              <w:t>{{COMMENT}}</w:t>
+              <w:t>{COMMENT}</w:t>
             </w:r>
           </w:p>
         </w:tc>
@@ -4285,7 +4285,7 @@
                 <w:sz w:val="14"/>
                 <w:highlight w:val="yellow"/>
               </w:rPr>
-              <w:t>{{OWNER}}</w:t>
+              <w:t>{OWNER}</w:t>
             </w:r>
           </w:p>
         </w:tc>
@@ -4318,7 +4318,7 @@
                 <w:sz w:val="14"/>
                 <w:highlight w:val="yellow"/>
               </w:rPr>
-              <w:t>{{FILE_REF}}</w:t>
+              <w:t>{FILE_REF}</w:t>
             </w:r>
           </w:p>
         </w:tc>
@@ -4351,7 +4351,7 @@
                 <w:sz w:val="14"/>
                 <w:highlight w:val="yellow"/>
               </w:rPr>
-              <w:t>{{STATUS}}</w:t>
+              <w:t>{STATUS}</w:t>
             </w:r>
           </w:p>
         </w:tc>
@@ -4384,7 +4384,7 @@
                 <w:sz w:val="14"/>
                 <w:highlight w:val="yellow"/>
               </w:rPr>
-              <w:t>{{COMMENT}}</w:t>
+              <w:t>{COMMENT}</w:t>
             </w:r>
           </w:p>
         </w:tc>
@@ -4488,7 +4488,7 @@
                 <w:sz w:val="14"/>
                 <w:highlight w:val="yellow"/>
               </w:rPr>
-              <w:t>{{OWNER}}</w:t>
+              <w:t>{OWNER}</w:t>
             </w:r>
           </w:p>
         </w:tc>
@@ -4522,7 +4522,7 @@
                 <w:sz w:val="14"/>
                 <w:highlight w:val="yellow"/>
               </w:rPr>
-              <w:t>{{FILE_REF}}</w:t>
+              <w:t>{FILE_REF}</w:t>
             </w:r>
           </w:p>
         </w:tc>
@@ -4556,7 +4556,7 @@
                 <w:sz w:val="14"/>
                 <w:highlight w:val="yellow"/>
               </w:rPr>
-              <w:t>{{STATUS}}</w:t>
+              <w:t>{STATUS}</w:t>
             </w:r>
           </w:p>
         </w:tc>
@@ -4590,7 +4590,7 @@
                 <w:sz w:val="14"/>
                 <w:highlight w:val="yellow"/>
               </w:rPr>
-              <w:t>{{COMMENT}}</w:t>
+              <w:t>{COMMENT}</w:t>
             </w:r>
           </w:p>
         </w:tc>
@@ -4691,7 +4691,7 @@
                 <w:sz w:val="14"/>
                 <w:highlight w:val="yellow"/>
               </w:rPr>
-              <w:t>{{OWNER}}</w:t>
+              <w:t>{OWNER}</w:t>
             </w:r>
           </w:p>
         </w:tc>
@@ -4724,7 +4724,7 @@
                 <w:sz w:val="14"/>
                 <w:highlight w:val="yellow"/>
               </w:rPr>
-              <w:t>{{FILE_REF}}</w:t>
+              <w:t>{FILE_REF}</w:t>
             </w:r>
           </w:p>
         </w:tc>
@@ -4757,7 +4757,7 @@
                 <w:sz w:val="14"/>
                 <w:highlight w:val="yellow"/>
               </w:rPr>
-              <w:t>{{STATUS}}</w:t>
+              <w:t>{STATUS}</w:t>
             </w:r>
           </w:p>
         </w:tc>
@@ -4790,7 +4790,7 @@
                 <w:sz w:val="14"/>
                 <w:highlight w:val="yellow"/>
               </w:rPr>
-              <w:t>{{COMMENT}}</w:t>
+              <w:t>{COMMENT}</w:t>
             </w:r>
           </w:p>
         </w:tc>
@@ -4894,7 +4894,7 @@
                 <w:sz w:val="14"/>
                 <w:highlight w:val="yellow"/>
               </w:rPr>
-              <w:t>{{OWNER}}</w:t>
+              <w:t>{OWNER}</w:t>
             </w:r>
           </w:p>
         </w:tc>
@@ -4928,7 +4928,7 @@
                 <w:sz w:val="14"/>
                 <w:highlight w:val="yellow"/>
               </w:rPr>
-              <w:t>{{FILE_REF}}</w:t>
+              <w:t>{FILE_REF}</w:t>
             </w:r>
           </w:p>
         </w:tc>
@@ -4962,7 +4962,7 @@
                 <w:sz w:val="14"/>
                 <w:highlight w:val="yellow"/>
               </w:rPr>
-              <w:t>{{STATUS}}</w:t>
+              <w:t>{STATUS}</w:t>
             </w:r>
           </w:p>
         </w:tc>
@@ -4996,7 +4996,7 @@
                 <w:sz w:val="14"/>
                 <w:highlight w:val="yellow"/>
               </w:rPr>
-              <w:t>{{COMMENT}}</w:t>
+              <w:t>{COMMENT}</w:t>
             </w:r>
           </w:p>
         </w:tc>
@@ -5097,7 +5097,7 @@
                 <w:sz w:val="14"/>
                 <w:highlight w:val="yellow"/>
               </w:rPr>
-              <w:t>{{OWNER}}</w:t>
+              <w:t>{OWNER}</w:t>
             </w:r>
           </w:p>
         </w:tc>
@@ -5130,7 +5130,7 @@
                 <w:sz w:val="14"/>
                 <w:highlight w:val="yellow"/>
               </w:rPr>
-              <w:t>{{FILE_REF}}</w:t>
+              <w:t>{FILE_REF}</w:t>
             </w:r>
           </w:p>
         </w:tc>
@@ -5163,7 +5163,7 @@
                 <w:sz w:val="14"/>
                 <w:highlight w:val="yellow"/>
               </w:rPr>
-              <w:t>{{STATUS}}</w:t>
+              <w:t>{STATUS}</w:t>
             </w:r>
           </w:p>
         </w:tc>
@@ -5196,7 +5196,7 @@
                 <w:sz w:val="14"/>
                 <w:highlight w:val="yellow"/>
               </w:rPr>
-              <w:t>{{COMMENT}}</w:t>
+              <w:t>{COMMENT}</w:t>
             </w:r>
           </w:p>
         </w:tc>
@@ -5300,7 +5300,7 @@
                 <w:sz w:val="14"/>
                 <w:highlight w:val="yellow"/>
               </w:rPr>
-              <w:t>{{OWNER}}</w:t>
+              <w:t>{OWNER}</w:t>
             </w:r>
           </w:p>
         </w:tc>
@@ -5334,7 +5334,7 @@
                 <w:sz w:val="14"/>
                 <w:highlight w:val="yellow"/>
               </w:rPr>
-              <w:t>{{FILE_REF}}</w:t>
+              <w:t>{FILE_REF}</w:t>
             </w:r>
           </w:p>
         </w:tc>
@@ -5368,7 +5368,7 @@
                 <w:sz w:val="14"/>
                 <w:highlight w:val="yellow"/>
               </w:rPr>
-              <w:t>{{STATUS}}</w:t>
+              <w:t>{STATUS}</w:t>
             </w:r>
           </w:p>
         </w:tc>
@@ -5402,7 +5402,7 @@
                 <w:sz w:val="14"/>
                 <w:highlight w:val="yellow"/>
               </w:rPr>
-              <w:t>{{COMMENT}}</w:t>
+              <w:t>{COMMENT}</w:t>
             </w:r>
           </w:p>
         </w:tc>
@@ -5503,7 +5503,7 @@
                 <w:sz w:val="14"/>
                 <w:highlight w:val="yellow"/>
               </w:rPr>
-              <w:t>{{OWNER}}</w:t>
+              <w:t>{OWNER}</w:t>
             </w:r>
           </w:p>
         </w:tc>
@@ -5536,7 +5536,7 @@
                 <w:sz w:val="14"/>
                 <w:highlight w:val="yellow"/>
               </w:rPr>
-              <w:t>{{FILE_REF}}</w:t>
+              <w:t>{FILE_REF}</w:t>
             </w:r>
           </w:p>
         </w:tc>
@@ -5569,7 +5569,7 @@
                 <w:sz w:val="14"/>
                 <w:highlight w:val="yellow"/>
               </w:rPr>
-              <w:t>{{STATUS}}</w:t>
+              <w:t>{STATUS}</w:t>
             </w:r>
           </w:p>
         </w:tc>
@@ -5602,7 +5602,7 @@
                 <w:sz w:val="14"/>
                 <w:highlight w:val="yellow"/>
               </w:rPr>
-              <w:t>{{COMMENT}}</w:t>
+              <w:t>{COMMENT}</w:t>
             </w:r>
           </w:p>
         </w:tc>
@@ -5706,7 +5706,7 @@
                 <w:sz w:val="14"/>
                 <w:highlight w:val="yellow"/>
               </w:rPr>
-              <w:t>{{OWNER}}</w:t>
+              <w:t>{OWNER}</w:t>
             </w:r>
           </w:p>
         </w:tc>
@@ -5740,7 +5740,7 @@
                 <w:sz w:val="14"/>
                 <w:highlight w:val="yellow"/>
               </w:rPr>
-              <w:t>{{FILE_REF}}</w:t>
+              <w:t>{FILE_REF}</w:t>
             </w:r>
           </w:p>
         </w:tc>
@@ -5774,7 +5774,7 @@
                 <w:sz w:val="14"/>
                 <w:highlight w:val="yellow"/>
               </w:rPr>
-              <w:t>{{STATUS}}</w:t>
+              <w:t>{STATUS}</w:t>
             </w:r>
           </w:p>
         </w:tc>
@@ -5808,7 +5808,7 @@
                 <w:sz w:val="14"/>
                 <w:highlight w:val="yellow"/>
               </w:rPr>
-              <w:t>{{COMMENT}}</w:t>
+              <w:t>{COMMENT}</w:t>
             </w:r>
           </w:p>
         </w:tc>
@@ -5909,7 +5909,7 @@
                 <w:sz w:val="14"/>
                 <w:highlight w:val="yellow"/>
               </w:rPr>
-              <w:t>{{OWNER}}</w:t>
+              <w:t>{OWNER}</w:t>
             </w:r>
           </w:p>
         </w:tc>
@@ -5942,7 +5942,7 @@
                 <w:sz w:val="14"/>
                 <w:highlight w:val="yellow"/>
               </w:rPr>
-              <w:t>{{FILE_REF}}</w:t>
+              <w:t>{FILE_REF}</w:t>
             </w:r>
           </w:p>
         </w:tc>
@@ -5975,7 +5975,7 @@
                 <w:sz w:val="14"/>
                 <w:highlight w:val="yellow"/>
               </w:rPr>
-              <w:t>{{STATUS}}</w:t>
+              <w:t>{STATUS}</w:t>
             </w:r>
           </w:p>
         </w:tc>
@@ -6008,7 +6008,7 @@
                 <w:sz w:val="14"/>
                 <w:highlight w:val="yellow"/>
               </w:rPr>
-              <w:t>{{COMMENT}}</w:t>
+              <w:t>{COMMENT}</w:t>
             </w:r>
           </w:p>
         </w:tc>
@@ -6380,7 +6380,7 @@
                 <w:sz w:val="14"/>
                 <w:highlight w:val="yellow"/>
               </w:rPr>
-              <w:t>{{TOTAL_ASSETS_CURRENT}}</w:t>
+              <w:t>{TOTAL_ASSETS_CURRENT}</w:t>
             </w:r>
           </w:p>
         </w:tc>
@@ -6414,7 +6414,7 @@
                 <w:sz w:val="14"/>
                 <w:highlight w:val="yellow"/>
               </w:rPr>
-              <w:t>{{TOTAL_ASSETS_PRIOR}}</w:t>
+              <w:t>{TOTAL_ASSETS_PRIOR}</w:t>
             </w:r>
           </w:p>
         </w:tc>
@@ -6448,7 +6448,7 @@
                 <w:sz w:val="14"/>
                 <w:highlight w:val="yellow"/>
               </w:rPr>
-              <w:t>{{TOTAL_ASSETS_MOVEMENT}}</w:t>
+              <w:t>{TOTAL_ASSETS_MOVEMENT}</w:t>
             </w:r>
           </w:p>
         </w:tc>
@@ -6482,7 +6482,7 @@
                 <w:sz w:val="14"/>
                 <w:highlight w:val="yellow"/>
               </w:rPr>
-              <w:t>{{TOTAL_ASSETS_MOVEMENT_PERCENT}}</w:t>
+              <w:t>{TOTAL_ASSETS_MOVEMENT_PERCENT}</w:t>
             </w:r>
           </w:p>
         </w:tc>
@@ -6516,7 +6516,7 @@
                 <w:sz w:val="14"/>
                 <w:highlight w:val="yellow"/>
               </w:rPr>
-              <w:t>{{COMMENT}}</w:t>
+              <w:t>{COMMENT}</w:t>
             </w:r>
           </w:p>
         </w:tc>
@@ -6584,7 +6584,7 @@
                 <w:sz w:val="14"/>
                 <w:highlight w:val="yellow"/>
               </w:rPr>
-              <w:t>{{TOTAL_LIABILITIES_CURRENT}}</w:t>
+              <w:t>{TOTAL_LIABILITIES_CURRENT}</w:t>
             </w:r>
           </w:p>
         </w:tc>
@@ -6617,7 +6617,7 @@
                 <w:sz w:val="14"/>
                 <w:highlight w:val="yellow"/>
               </w:rPr>
-              <w:t>{{TOTAL_LIABILITIES_PRIOR}}</w:t>
+              <w:t>{TOTAL_LIABILITIES_PRIOR}</w:t>
             </w:r>
           </w:p>
         </w:tc>
@@ -6650,7 +6650,7 @@
                 <w:sz w:val="14"/>
                 <w:highlight w:val="yellow"/>
               </w:rPr>
-              <w:t>{{TOTAL_LIABILITIES_MOVEMENT}}</w:t>
+              <w:t>{TOTAL_LIABILITIES_MOVEMENT}</w:t>
             </w:r>
           </w:p>
         </w:tc>
@@ -6683,7 +6683,7 @@
                 <w:sz w:val="14"/>
                 <w:highlight w:val="yellow"/>
               </w:rPr>
-              <w:t>{{TOTAL_LIABILITIES_MOVEMENT_PERCENT}}</w:t>
+              <w:t>{TOTAL_LIABILITIES_MOVEMENT_PERCENT}</w:t>
             </w:r>
           </w:p>
         </w:tc>
@@ -6716,7 +6716,7 @@
                 <w:sz w:val="14"/>
                 <w:highlight w:val="yellow"/>
               </w:rPr>
-              <w:t>{{COMMENT}}</w:t>
+              <w:t>{COMMENT}</w:t>
             </w:r>
           </w:p>
         </w:tc>
@@ -6786,7 +6786,7 @@
                 <w:sz w:val="14"/>
                 <w:highlight w:val="yellow"/>
               </w:rPr>
-              <w:t>{{NET_ASSETS_CURRENT}}</w:t>
+              <w:t>{NET_ASSETS_CURRENT}</w:t>
             </w:r>
           </w:p>
         </w:tc>
@@ -6820,7 +6820,7 @@
                 <w:sz w:val="14"/>
                 <w:highlight w:val="yellow"/>
               </w:rPr>
-              <w:t>{{NET_ASSETS_PRIOR}}</w:t>
+              <w:t>{NET_ASSETS_PRIOR}</w:t>
             </w:r>
           </w:p>
         </w:tc>
@@ -6854,7 +6854,7 @@
                 <w:sz w:val="14"/>
                 <w:highlight w:val="yellow"/>
               </w:rPr>
-              <w:t>{{NET_ASSETS_MOVEMENT}}</w:t>
+              <w:t>{NET_ASSETS_MOVEMENT}</w:t>
             </w:r>
           </w:p>
         </w:tc>
@@ -6888,7 +6888,7 @@
                 <w:sz w:val="14"/>
                 <w:highlight w:val="yellow"/>
               </w:rPr>
-              <w:t>{{NET_ASSETS_MOVEMENT_PERCENT}}</w:t>
+              <w:t>{NET_ASSETS_MOVEMENT_PERCENT}</w:t>
             </w:r>
           </w:p>
         </w:tc>
@@ -6922,7 +6922,7 @@
                 <w:sz w:val="14"/>
                 <w:highlight w:val="yellow"/>
               </w:rPr>
-              <w:t>{{COMMENT}}</w:t>
+              <w:t>{COMMENT}</w:t>
             </w:r>
           </w:p>
         </w:tc>
@@ -6990,7 +6990,7 @@
                 <w:sz w:val="14"/>
                 <w:highlight w:val="yellow"/>
               </w:rPr>
-              <w:t>{{REVENUE_CURRENT}}</w:t>
+              <w:t>{REVENUE_CURRENT}</w:t>
             </w:r>
           </w:p>
         </w:tc>
@@ -7023,7 +7023,7 @@
                 <w:sz w:val="14"/>
                 <w:highlight w:val="yellow"/>
               </w:rPr>
-              <w:t>{{REVENUE_PRIOR}}</w:t>
+              <w:t>{REVENUE_PRIOR}</w:t>
             </w:r>
           </w:p>
         </w:tc>
@@ -7056,7 +7056,7 @@
                 <w:sz w:val="14"/>
                 <w:highlight w:val="yellow"/>
               </w:rPr>
-              <w:t>{{REVENUE_MOVEMENT}}</w:t>
+              <w:t>{REVENUE_MOVEMENT}</w:t>
             </w:r>
           </w:p>
         </w:tc>
@@ -7089,7 +7089,7 @@
                 <w:sz w:val="14"/>
                 <w:highlight w:val="yellow"/>
               </w:rPr>
-              <w:t>{{REVENUE_MOVEMENT_PERCENT}}</w:t>
+              <w:t>{REVENUE_MOVEMENT_PERCENT}</w:t>
             </w:r>
           </w:p>
         </w:tc>
@@ -7122,7 +7122,7 @@
                 <w:sz w:val="14"/>
                 <w:highlight w:val="yellow"/>
               </w:rPr>
-              <w:t>{{COMMENT}}</w:t>
+              <w:t>{COMMENT}</w:t>
             </w:r>
           </w:p>
         </w:tc>
@@ -7192,7 +7192,7 @@
                 <w:sz w:val="14"/>
                 <w:highlight w:val="yellow"/>
               </w:rPr>
-              <w:t>{{OPERATING_EXPENSES_CURRENT}}</w:t>
+              <w:t>{OPERATING_EXPENSES_CURRENT}</w:t>
             </w:r>
           </w:p>
         </w:tc>
@@ -7226,7 +7226,7 @@
                 <w:sz w:val="14"/>
                 <w:highlight w:val="yellow"/>
               </w:rPr>
-              <w:t>{{OPERATING_EXPENSES_PRIOR}}</w:t>
+              <w:t>{OPERATING_EXPENSES_PRIOR}</w:t>
             </w:r>
           </w:p>
         </w:tc>
@@ -7260,7 +7260,7 @@
                 <w:sz w:val="14"/>
                 <w:highlight w:val="yellow"/>
               </w:rPr>
-              <w:t>{{OPERATING_EXPENSES_MOVEMENT}}</w:t>
+              <w:t>{OPERATING_EXPENSES_MOVEMENT}</w:t>
             </w:r>
           </w:p>
         </w:tc>
@@ -7294,7 +7294,7 @@
                 <w:sz w:val="14"/>
                 <w:highlight w:val="yellow"/>
               </w:rPr>
-              <w:t>{{OPERATING_EXPENSES_MOVEMENT_PERCENT}}</w:t>
+              <w:t>{OPERATING_EXPENSES_MOVEMENT_PERCENT}</w:t>
             </w:r>
           </w:p>
         </w:tc>
@@ -7328,7 +7328,7 @@
                 <w:sz w:val="14"/>
                 <w:highlight w:val="yellow"/>
               </w:rPr>
-              <w:t>{{COMMENT}}</w:t>
+              <w:t>{COMMENT}</w:t>
             </w:r>
           </w:p>
         </w:tc>
@@ -7396,7 +7396,7 @@
                 <w:sz w:val="14"/>
                 <w:highlight w:val="yellow"/>
               </w:rPr>
-              <w:t>{{PBT_CURRENT}}</w:t>
+              <w:t>{PBT_CURRENT}</w:t>
             </w:r>
           </w:p>
         </w:tc>
@@ -7429,7 +7429,7 @@
                 <w:sz w:val="14"/>
                 <w:highlight w:val="yellow"/>
               </w:rPr>
-              <w:t>{{PBT_PRIOR}}</w:t>
+              <w:t>{PBT_PRIOR}</w:t>
             </w:r>
           </w:p>
         </w:tc>
@@ -7462,7 +7462,7 @@
                 <w:sz w:val="14"/>
                 <w:highlight w:val="yellow"/>
               </w:rPr>
-              <w:t>{{PBT_MOVEMENT}}</w:t>
+              <w:t>{PBT_MOVEMENT}</w:t>
             </w:r>
           </w:p>
         </w:tc>
@@ -7495,7 +7495,7 @@
                 <w:sz w:val="14"/>
                 <w:highlight w:val="yellow"/>
               </w:rPr>
-              <w:t>{{PBT_MOVEMENT_PERCENT}}</w:t>
+              <w:t>{PBT_MOVEMENT_PERCENT}</w:t>
             </w:r>
           </w:p>
         </w:tc>
@@ -7528,7 +7528,7 @@
                 <w:sz w:val="14"/>
                 <w:highlight w:val="yellow"/>
               </w:rPr>
-              <w:t>{{COMMENT}}</w:t>
+              <w:t>{COMMENT}</w:t>
             </w:r>
           </w:p>
         </w:tc>
@@ -7598,7 +7598,7 @@
                 <w:sz w:val="14"/>
                 <w:highlight w:val="yellow"/>
               </w:rPr>
-              <w:t>{{CLOSING_AUM_FUM_CURRENT}}</w:t>
+              <w:t>{CLOSING_AUM_FUM_CURRENT}</w:t>
             </w:r>
           </w:p>
         </w:tc>
@@ -7632,7 +7632,7 @@
                 <w:sz w:val="14"/>
                 <w:highlight w:val="yellow"/>
               </w:rPr>
-              <w:t>{{CLOSING_AUM_FUM_PRIOR}}</w:t>
+              <w:t>{CLOSING_AUM_FUM_PRIOR}</w:t>
             </w:r>
           </w:p>
         </w:tc>
@@ -7666,7 +7666,7 @@
                 <w:sz w:val="14"/>
                 <w:highlight w:val="yellow"/>
               </w:rPr>
-              <w:t>{{AUM_FUM_MOVEMENT}}</w:t>
+              <w:t>{AUM_FUM_MOVEMENT}</w:t>
             </w:r>
           </w:p>
         </w:tc>
@@ -7700,7 +7700,7 @@
                 <w:sz w:val="14"/>
                 <w:highlight w:val="yellow"/>
               </w:rPr>
-              <w:t>{{AUM_FUM_MOVEMENT_PERCENT}}</w:t>
+              <w:t>{AUM_FUM_MOVEMENT_PERCENT}</w:t>
             </w:r>
           </w:p>
         </w:tc>
@@ -7734,7 +7734,7 @@
                 <w:sz w:val="14"/>
                 <w:highlight w:val="yellow"/>
               </w:rPr>
-              <w:t>{{COMMENT}}</w:t>
+              <w:t>{COMMENT}</w:t>
             </w:r>
           </w:p>
         </w:tc>
@@ -7802,7 +7802,7 @@
                 <w:sz w:val="14"/>
                 <w:highlight w:val="yellow"/>
               </w:rPr>
-              <w:t>{{CAR_CURRENT}}</w:t>
+              <w:t>{CAR_CURRENT}</w:t>
             </w:r>
           </w:p>
         </w:tc>
@@ -7835,7 +7835,7 @@
                 <w:sz w:val="14"/>
                 <w:highlight w:val="yellow"/>
               </w:rPr>
-              <w:t>{{CAR_PRIOR}}</w:t>
+              <w:t>{CAR_PRIOR}</w:t>
             </w:r>
           </w:p>
         </w:tc>
@@ -7868,7 +7868,7 @@
                 <w:sz w:val="14"/>
                 <w:highlight w:val="yellow"/>
               </w:rPr>
-              <w:t>{{CAR_MOVEMENT}}</w:t>
+              <w:t>{CAR_MOVEMENT}</w:t>
             </w:r>
           </w:p>
         </w:tc>
@@ -7901,7 +7901,7 @@
                 <w:sz w:val="14"/>
                 <w:highlight w:val="yellow"/>
               </w:rPr>
-              <w:t>{{CAR_MOVEMENT_PERCENT}}</w:t>
+              <w:t>{CAR_MOVEMENT_PERCENT}</w:t>
             </w:r>
           </w:p>
         </w:tc>
@@ -7934,7 +7934,7 @@
                 <w:sz w:val="14"/>
                 <w:highlight w:val="yellow"/>
               </w:rPr>
-              <w:t>{{COMMENT}}</w:t>
+              <w:t>{COMMENT}</w:t>
             </w:r>
           </w:p>
         </w:tc>
@@ -8248,7 +8248,7 @@
                 <w:sz w:val="14"/>
                 <w:highlight w:val="yellow"/>
               </w:rPr>
-              <w:t>{{CASH_AND_BANK}}</w:t>
+              <w:t>{CASH_AND_BANK}</w:t>
             </w:r>
           </w:p>
         </w:tc>
@@ -8282,7 +8282,7 @@
                 <w:sz w:val="14"/>
                 <w:highlight w:val="yellow"/>
               </w:rPr>
-              <w:t>{{LEDGER_REF}}</w:t>
+              <w:t>{LEDGER_REF}</w:t>
             </w:r>
           </w:p>
         </w:tc>
@@ -8316,7 +8316,7 @@
                 <w:sz w:val="14"/>
                 <w:highlight w:val="yellow"/>
               </w:rPr>
-              <w:t>{{REVIEW_STATUS}}</w:t>
+              <w:t>{REVIEW_STATUS}</w:t>
             </w:r>
           </w:p>
         </w:tc>
@@ -8417,7 +8417,7 @@
                 <w:sz w:val="14"/>
                 <w:highlight w:val="yellow"/>
               </w:rPr>
-              <w:t>{{RECEIVABLES}}</w:t>
+              <w:t>{RECEIVABLES}</w:t>
             </w:r>
           </w:p>
         </w:tc>
@@ -8450,7 +8450,7 @@
                 <w:sz w:val="14"/>
                 <w:highlight w:val="yellow"/>
               </w:rPr>
-              <w:t>{{LEDGER_REF}}</w:t>
+              <w:t>{LEDGER_REF}</w:t>
             </w:r>
           </w:p>
         </w:tc>
@@ -8483,7 +8483,7 @@
                 <w:sz w:val="14"/>
                 <w:highlight w:val="yellow"/>
               </w:rPr>
-              <w:t>{{REVIEW_STATUS}}</w:t>
+              <w:t>{REVIEW_STATUS}</w:t>
             </w:r>
           </w:p>
         </w:tc>
@@ -8587,7 +8587,7 @@
                 <w:sz w:val="14"/>
                 <w:highlight w:val="yellow"/>
               </w:rPr>
-              <w:t>{{MANAGER_INVESTMENTS}}</w:t>
+              <w:t>{MANAGER_INVESTMENTS}</w:t>
             </w:r>
           </w:p>
         </w:tc>
@@ -8621,7 +8621,7 @@
                 <w:sz w:val="14"/>
                 <w:highlight w:val="yellow"/>
               </w:rPr>
-              <w:t>{{LEDGER_REF}}</w:t>
+              <w:t>{LEDGER_REF}</w:t>
             </w:r>
           </w:p>
         </w:tc>
@@ -8655,7 +8655,7 @@
                 <w:sz w:val="14"/>
                 <w:highlight w:val="yellow"/>
               </w:rPr>
-              <w:t>{{REVIEW_STATUS}}</w:t>
+              <w:t>{REVIEW_STATUS}</w:t>
             </w:r>
           </w:p>
         </w:tc>
@@ -8756,7 +8756,7 @@
                 <w:sz w:val="14"/>
                 <w:highlight w:val="yellow"/>
               </w:rPr>
-              <w:t>{{PROPERTY_EQUIPMENT}}</w:t>
+              <w:t>{PROPERTY_EQUIPMENT}</w:t>
             </w:r>
           </w:p>
         </w:tc>
@@ -8789,7 +8789,7 @@
                 <w:sz w:val="14"/>
                 <w:highlight w:val="yellow"/>
               </w:rPr>
-              <w:t>{{LEDGER_REF}}</w:t>
+              <w:t>{LEDGER_REF}</w:t>
             </w:r>
           </w:p>
         </w:tc>
@@ -8822,7 +8822,7 @@
                 <w:sz w:val="14"/>
                 <w:highlight w:val="yellow"/>
               </w:rPr>
-              <w:t>{{REVIEW_STATUS}}</w:t>
+              <w:t>{REVIEW_STATUS}</w:t>
             </w:r>
           </w:p>
         </w:tc>
@@ -8926,7 +8926,7 @@
                 <w:sz w:val="14"/>
                 <w:highlight w:val="yellow"/>
               </w:rPr>
-              <w:t>{{OTHER_ASSETS}}</w:t>
+              <w:t>{OTHER_ASSETS}</w:t>
             </w:r>
           </w:p>
         </w:tc>
@@ -8960,7 +8960,7 @@
                 <w:sz w:val="14"/>
                 <w:highlight w:val="yellow"/>
               </w:rPr>
-              <w:t>{{LEDGER_REF}}</w:t>
+              <w:t>{LEDGER_REF}</w:t>
             </w:r>
           </w:p>
         </w:tc>
@@ -8994,7 +8994,7 @@
                 <w:sz w:val="14"/>
                 <w:highlight w:val="yellow"/>
               </w:rPr>
-              <w:t>{{REVIEW_STATUS}}</w:t>
+              <w:t>{REVIEW_STATUS}</w:t>
             </w:r>
           </w:p>
         </w:tc>
@@ -9095,7 +9095,7 @@
                 <w:sz w:val="14"/>
                 <w:highlight w:val="yellow"/>
               </w:rPr>
-              <w:t>{{PAYABLES}}</w:t>
+              <w:t>{PAYABLES}</w:t>
             </w:r>
           </w:p>
         </w:tc>
@@ -9128,7 +9128,7 @@
                 <w:sz w:val="14"/>
                 <w:highlight w:val="yellow"/>
               </w:rPr>
-              <w:t>{{LEDGER_REF}}</w:t>
+              <w:t>{LEDGER_REF}</w:t>
             </w:r>
           </w:p>
         </w:tc>
@@ -9161,7 +9161,7 @@
                 <w:sz w:val="14"/>
                 <w:highlight w:val="yellow"/>
               </w:rPr>
-              <w:t>{{REVIEW_STATUS}}</w:t>
+              <w:t>{REVIEW_STATUS}</w:t>
             </w:r>
           </w:p>
         </w:tc>
@@ -9265,7 +9265,7 @@
                 <w:sz w:val="14"/>
                 <w:highlight w:val="yellow"/>
               </w:rPr>
-              <w:t>{{TAX_LIABILITIES}}</w:t>
+              <w:t>{TAX_LIABILITIES}</w:t>
             </w:r>
           </w:p>
         </w:tc>
@@ -9299,7 +9299,7 @@
                 <w:sz w:val="14"/>
                 <w:highlight w:val="yellow"/>
               </w:rPr>
-              <w:t>{{LEDGER_REF}}</w:t>
+              <w:t>{LEDGER_REF}</w:t>
             </w:r>
           </w:p>
         </w:tc>
@@ -9333,7 +9333,7 @@
                 <w:sz w:val="14"/>
                 <w:highlight w:val="yellow"/>
               </w:rPr>
-              <w:t>{{REVIEW_STATUS}}</w:t>
+              <w:t>{REVIEW_STATUS}</w:t>
             </w:r>
           </w:p>
         </w:tc>
@@ -9434,7 +9434,7 @@
                 <w:sz w:val="14"/>
                 <w:highlight w:val="yellow"/>
               </w:rPr>
-              <w:t>{{BORROWINGS}}</w:t>
+              <w:t>{BORROWINGS}</w:t>
             </w:r>
           </w:p>
         </w:tc>
@@ -9467,7 +9467,7 @@
                 <w:sz w:val="14"/>
                 <w:highlight w:val="yellow"/>
               </w:rPr>
-              <w:t>{{LEDGER_REF}}</w:t>
+              <w:t>{LEDGER_REF}</w:t>
             </w:r>
           </w:p>
         </w:tc>
@@ -9500,7 +9500,7 @@
                 <w:sz w:val="14"/>
                 <w:highlight w:val="yellow"/>
               </w:rPr>
-              <w:t>{{REVIEW_STATUS}}</w:t>
+              <w:t>{REVIEW_STATUS}</w:t>
             </w:r>
           </w:p>
         </w:tc>
@@ -9604,7 +9604,7 @@
                 <w:sz w:val="14"/>
                 <w:highlight w:val="yellow"/>
               </w:rPr>
-              <w:t>{{EQUITY_AND_RESERVES}}</w:t>
+              <w:t>{EQUITY_AND_RESERVES}</w:t>
             </w:r>
           </w:p>
         </w:tc>
@@ -9638,7 +9638,7 @@
                 <w:sz w:val="14"/>
                 <w:highlight w:val="yellow"/>
               </w:rPr>
-              <w:t>{{LEDGER_REF}}</w:t>
+              <w:t>{LEDGER_REF}</w:t>
             </w:r>
           </w:p>
         </w:tc>
@@ -9672,7 +9672,7 @@
                 <w:sz w:val="14"/>
                 <w:highlight w:val="yellow"/>
               </w:rPr>
-              <w:t>{{REVIEW_STATUS}}</w:t>
+              <w:t>{REVIEW_STATUS}</w:t>
             </w:r>
           </w:p>
         </w:tc>
@@ -9773,7 +9773,7 @@
                 <w:sz w:val="14"/>
                 <w:highlight w:val="yellow"/>
               </w:rPr>
-              <w:t>{{NET_ASSETS_EQUITY}}</w:t>
+              <w:t>{NET_ASSETS_EQUITY}</w:t>
             </w:r>
           </w:p>
         </w:tc>
@@ -9806,7 +9806,7 @@
                 <w:sz w:val="14"/>
                 <w:highlight w:val="yellow"/>
               </w:rPr>
-              <w:t>{{TB_REF}}</w:t>
+              <w:t>{TB_REF}</w:t>
             </w:r>
           </w:p>
         </w:tc>
@@ -9839,7 +9839,7 @@
                 <w:sz w:val="14"/>
                 <w:highlight w:val="yellow"/>
               </w:rPr>
-              <w:t>{{REVIEW_STATUS}}</w:t>
+              <w:t>{REVIEW_STATUS}</w:t>
             </w:r>
           </w:p>
         </w:tc>
@@ -10155,7 +10155,7 @@
                 <w:sz w:val="14"/>
                 <w:highlight w:val="yellow"/>
               </w:rPr>
-              <w:t>{{MANAGEMENT_FEES}}</w:t>
+              <w:t>{MANAGEMENT_FEES}</w:t>
             </w:r>
           </w:p>
         </w:tc>
@@ -10189,7 +10189,7 @@
                 <w:sz w:val="14"/>
                 <w:highlight w:val="yellow"/>
               </w:rPr>
-              <w:t>{{BUDGET_OR_PRIOR}}</w:t>
+              <w:t>{BUDGET_OR_PRIOR}</w:t>
             </w:r>
           </w:p>
         </w:tc>
@@ -10223,7 +10223,7 @@
                 <w:sz w:val="14"/>
                 <w:highlight w:val="yellow"/>
               </w:rPr>
-              <w:t>{{VARIANCE}}</w:t>
+              <w:t>{VARIANCE}</w:t>
             </w:r>
           </w:p>
         </w:tc>
@@ -10257,7 +10257,7 @@
                 <w:sz w:val="14"/>
                 <w:highlight w:val="yellow"/>
               </w:rPr>
-              <w:t>{{LEDGER_REF}}</w:t>
+              <w:t>{LEDGER_REF}</w:t>
             </w:r>
           </w:p>
         </w:tc>
@@ -10291,7 +10291,7 @@
                 <w:sz w:val="14"/>
                 <w:highlight w:val="yellow"/>
               </w:rPr>
-              <w:t>{{COMMENT}}</w:t>
+              <w:t>{COMMENT}</w:t>
             </w:r>
           </w:p>
         </w:tc>
@@ -10359,7 +10359,7 @@
                 <w:sz w:val="14"/>
                 <w:highlight w:val="yellow"/>
               </w:rPr>
-              <w:t>{{ADVISORY_PERFORMANCE_FEES}}</w:t>
+              <w:t>{ADVISORY_PERFORMANCE_FEES}</w:t>
             </w:r>
           </w:p>
         </w:tc>
@@ -10392,7 +10392,7 @@
                 <w:sz w:val="14"/>
                 <w:highlight w:val="yellow"/>
               </w:rPr>
-              <w:t>{{BUDGET_OR_PRIOR}}</w:t>
+              <w:t>{BUDGET_OR_PRIOR}</w:t>
             </w:r>
           </w:p>
         </w:tc>
@@ -10425,7 +10425,7 @@
                 <w:sz w:val="14"/>
                 <w:highlight w:val="yellow"/>
               </w:rPr>
-              <w:t>{{VARIANCE}}</w:t>
+              <w:t>{VARIANCE}</w:t>
             </w:r>
           </w:p>
         </w:tc>
@@ -10458,7 +10458,7 @@
                 <w:sz w:val="14"/>
                 <w:highlight w:val="yellow"/>
               </w:rPr>
-              <w:t>{{LEDGER_REF}}</w:t>
+              <w:t>{LEDGER_REF}</w:t>
             </w:r>
           </w:p>
         </w:tc>
@@ -10491,7 +10491,7 @@
                 <w:sz w:val="14"/>
                 <w:highlight w:val="yellow"/>
               </w:rPr>
-              <w:t>{{COMMENT}}</w:t>
+              <w:t>{COMMENT}</w:t>
             </w:r>
           </w:p>
         </w:tc>
@@ -10561,7 +10561,7 @@
                 <w:sz w:val="14"/>
                 <w:highlight w:val="yellow"/>
               </w:rPr>
-              <w:t>{{OTHER_INCOME}}</w:t>
+              <w:t>{OTHER_INCOME}</w:t>
             </w:r>
           </w:p>
         </w:tc>
@@ -10595,7 +10595,7 @@
                 <w:sz w:val="14"/>
                 <w:highlight w:val="yellow"/>
               </w:rPr>
-              <w:t>{{BUDGET_OR_PRIOR}}</w:t>
+              <w:t>{BUDGET_OR_PRIOR}</w:t>
             </w:r>
           </w:p>
         </w:tc>
@@ -10629,7 +10629,7 @@
                 <w:sz w:val="14"/>
                 <w:highlight w:val="yellow"/>
               </w:rPr>
-              <w:t>{{VARIANCE}}</w:t>
+              <w:t>{VARIANCE}</w:t>
             </w:r>
           </w:p>
         </w:tc>
@@ -10663,7 +10663,7 @@
                 <w:sz w:val="14"/>
                 <w:highlight w:val="yellow"/>
               </w:rPr>
-              <w:t>{{LEDGER_REF}}</w:t>
+              <w:t>{LEDGER_REF}</w:t>
             </w:r>
           </w:p>
         </w:tc>
@@ -10697,7 +10697,7 @@
                 <w:sz w:val="14"/>
                 <w:highlight w:val="yellow"/>
               </w:rPr>
-              <w:t>{{COMMENT}}</w:t>
+              <w:t>{COMMENT}</w:t>
             </w:r>
           </w:p>
         </w:tc>
@@ -10765,7 +10765,7 @@
                 <w:sz w:val="14"/>
                 <w:highlight w:val="yellow"/>
               </w:rPr>
-              <w:t>{{STAFF_COSTS}}</w:t>
+              <w:t>{STAFF_COSTS}</w:t>
             </w:r>
           </w:p>
         </w:tc>
@@ -10798,7 +10798,7 @@
                 <w:sz w:val="14"/>
                 <w:highlight w:val="yellow"/>
               </w:rPr>
-              <w:t>{{BUDGET_OR_PRIOR}}</w:t>
+              <w:t>{BUDGET_OR_PRIOR}</w:t>
             </w:r>
           </w:p>
         </w:tc>
@@ -10831,7 +10831,7 @@
                 <w:sz w:val="14"/>
                 <w:highlight w:val="yellow"/>
               </w:rPr>
-              <w:t>{{VARIANCE}}</w:t>
+              <w:t>{VARIANCE}</w:t>
             </w:r>
           </w:p>
         </w:tc>
@@ -10864,7 +10864,7 @@
                 <w:sz w:val="14"/>
                 <w:highlight w:val="yellow"/>
               </w:rPr>
-              <w:t>{{LEDGER_REF}}</w:t>
+              <w:t>{LEDGER_REF}</w:t>
             </w:r>
           </w:p>
         </w:tc>
@@ -10897,7 +10897,7 @@
                 <w:sz w:val="14"/>
                 <w:highlight w:val="yellow"/>
               </w:rPr>
-              <w:t>{{COMMENT}}</w:t>
+              <w:t>{COMMENT}</w:t>
             </w:r>
           </w:p>
         </w:tc>
@@ -10967,7 +10967,7 @@
                 <w:sz w:val="14"/>
                 <w:highlight w:val="yellow"/>
               </w:rPr>
-              <w:t>{{PROFESSIONAL_FEES}}</w:t>
+              <w:t>{PROFESSIONAL_FEES}</w:t>
             </w:r>
           </w:p>
         </w:tc>
@@ -11001,7 +11001,7 @@
                 <w:sz w:val="14"/>
                 <w:highlight w:val="yellow"/>
               </w:rPr>
-              <w:t>{{BUDGET_OR_PRIOR}}</w:t>
+              <w:t>{BUDGET_OR_PRIOR}</w:t>
             </w:r>
           </w:p>
         </w:tc>
@@ -11035,7 +11035,7 @@
                 <w:sz w:val="14"/>
                 <w:highlight w:val="yellow"/>
               </w:rPr>
-              <w:t>{{VARIANCE}}</w:t>
+              <w:t>{VARIANCE}</w:t>
             </w:r>
           </w:p>
         </w:tc>
@@ -11069,7 +11069,7 @@
                 <w:sz w:val="14"/>
                 <w:highlight w:val="yellow"/>
               </w:rPr>
-              <w:t>{{LEDGER_REF}}</w:t>
+              <w:t>{LEDGER_REF}</w:t>
             </w:r>
           </w:p>
         </w:tc>
@@ -11103,7 +11103,7 @@
                 <w:sz w:val="14"/>
                 <w:highlight w:val="yellow"/>
               </w:rPr>
-              <w:t>{{COMMENT}}</w:t>
+              <w:t>{COMMENT}</w:t>
             </w:r>
           </w:p>
         </w:tc>
@@ -11171,7 +11171,7 @@
                 <w:sz w:val="14"/>
                 <w:highlight w:val="yellow"/>
               </w:rPr>
-              <w:t>{{COMPLIANCE_LICENCE_FEES}}</w:t>
+              <w:t>{COMPLIANCE_LICENCE_FEES}</w:t>
             </w:r>
           </w:p>
         </w:tc>
@@ -11204,7 +11204,7 @@
                 <w:sz w:val="14"/>
                 <w:highlight w:val="yellow"/>
               </w:rPr>
-              <w:t>{{BUDGET_OR_PRIOR}}</w:t>
+              <w:t>{BUDGET_OR_PRIOR}</w:t>
             </w:r>
           </w:p>
         </w:tc>
@@ -11237,7 +11237,7 @@
                 <w:sz w:val="14"/>
                 <w:highlight w:val="yellow"/>
               </w:rPr>
-              <w:t>{{VARIANCE}}</w:t>
+              <w:t>{VARIANCE}</w:t>
             </w:r>
           </w:p>
         </w:tc>
@@ -11270,7 +11270,7 @@
                 <w:sz w:val="14"/>
                 <w:highlight w:val="yellow"/>
               </w:rPr>
-              <w:t>{{LEDGER_REF}}</w:t>
+              <w:t>{LEDGER_REF}</w:t>
             </w:r>
           </w:p>
         </w:tc>
@@ -11303,7 +11303,7 @@
                 <w:sz w:val="14"/>
                 <w:highlight w:val="yellow"/>
               </w:rPr>
-              <w:t>{{COMMENT}}</w:t>
+              <w:t>{COMMENT}</w:t>
             </w:r>
           </w:p>
         </w:tc>
@@ -11373,7 +11373,7 @@
                 <w:sz w:val="14"/>
                 <w:highlight w:val="yellow"/>
               </w:rPr>
-              <w:t>{{TECH_ADMIN_COSTS}}</w:t>
+              <w:t>{TECH_ADMIN_COSTS}</w:t>
             </w:r>
           </w:p>
         </w:tc>
@@ -11407,7 +11407,7 @@
                 <w:sz w:val="14"/>
                 <w:highlight w:val="yellow"/>
               </w:rPr>
-              <w:t>{{BUDGET_OR_PRIOR}}</w:t>
+              <w:t>{BUDGET_OR_PRIOR}</w:t>
             </w:r>
           </w:p>
         </w:tc>
@@ -11441,7 +11441,7 @@
                 <w:sz w:val="14"/>
                 <w:highlight w:val="yellow"/>
               </w:rPr>
-              <w:t>{{VARIANCE}}</w:t>
+              <w:t>{VARIANCE}</w:t>
             </w:r>
           </w:p>
         </w:tc>
@@ -11475,7 +11475,7 @@
                 <w:sz w:val="14"/>
                 <w:highlight w:val="yellow"/>
               </w:rPr>
-              <w:t>{{LEDGER_REF}}</w:t>
+              <w:t>{LEDGER_REF}</w:t>
             </w:r>
           </w:p>
         </w:tc>
@@ -11509,7 +11509,7 @@
                 <w:sz w:val="14"/>
                 <w:highlight w:val="yellow"/>
               </w:rPr>
-              <w:t>{{COMMENT}}</w:t>
+              <w:t>{COMMENT}</w:t>
             </w:r>
           </w:p>
         </w:tc>
@@ -11577,7 +11577,7 @@
                 <w:sz w:val="14"/>
                 <w:highlight w:val="yellow"/>
               </w:rPr>
-              <w:t>{{TAX_EXPENSE}}</w:t>
+              <w:t>{TAX_EXPENSE}</w:t>
             </w:r>
           </w:p>
         </w:tc>
@@ -11610,7 +11610,7 @@
                 <w:sz w:val="14"/>
                 <w:highlight w:val="yellow"/>
               </w:rPr>
-              <w:t>{{BUDGET_OR_PRIOR}}</w:t>
+              <w:t>{BUDGET_OR_PRIOR}</w:t>
             </w:r>
           </w:p>
         </w:tc>
@@ -11643,7 +11643,7 @@
                 <w:sz w:val="14"/>
                 <w:highlight w:val="yellow"/>
               </w:rPr>
-              <w:t>{{VARIANCE}}</w:t>
+              <w:t>{VARIANCE}</w:t>
             </w:r>
           </w:p>
         </w:tc>
@@ -11676,7 +11676,7 @@
                 <w:sz w:val="14"/>
                 <w:highlight w:val="yellow"/>
               </w:rPr>
-              <w:t>{{LEDGER_REF}}</w:t>
+              <w:t>{LEDGER_REF}</w:t>
             </w:r>
           </w:p>
         </w:tc>
@@ -11709,7 +11709,7 @@
                 <w:sz w:val="14"/>
                 <w:highlight w:val="yellow"/>
               </w:rPr>
-              <w:t>{{COMMENT}}</w:t>
+              <w:t>{COMMENT}</w:t>
             </w:r>
           </w:p>
         </w:tc>
@@ -11779,7 +11779,7 @@
                 <w:sz w:val="14"/>
                 <w:highlight w:val="yellow"/>
               </w:rPr>
-              <w:t>{{PAT}}</w:t>
+              <w:t>{PAT}</w:t>
             </w:r>
           </w:p>
         </w:tc>
@@ -11813,7 +11813,7 @@
                 <w:sz w:val="14"/>
                 <w:highlight w:val="yellow"/>
               </w:rPr>
-              <w:t>{{BUDGET_OR_PRIOR}}</w:t>
+              <w:t>{BUDGET_OR_PRIOR}</w:t>
             </w:r>
           </w:p>
         </w:tc>
@@ -11847,7 +11847,7 @@
                 <w:sz w:val="14"/>
                 <w:highlight w:val="yellow"/>
               </w:rPr>
-              <w:t>{{VARIANCE}}</w:t>
+              <w:t>{VARIANCE}</w:t>
             </w:r>
           </w:p>
         </w:tc>
@@ -11881,7 +11881,7 @@
                 <w:sz w:val="14"/>
                 <w:highlight w:val="yellow"/>
               </w:rPr>
-              <w:t>{{LEDGER_REF}}</w:t>
+              <w:t>{LEDGER_REF}</w:t>
             </w:r>
           </w:p>
         </w:tc>
@@ -11915,7 +11915,7 @@
                 <w:sz w:val="14"/>
                 <w:highlight w:val="yellow"/>
               </w:rPr>
-              <w:t>{{COMMENT}}</w:t>
+              <w:t>{COMMENT}</w:t>
             </w:r>
           </w:p>
         </w:tc>
@@ -12325,7 +12325,7 @@
                 <w:sz w:val="13"/>
                 <w:highlight w:val="yellow"/>
               </w:rPr>
-              <w:t>{{PORTFOLIO_OR_PRODUCT_1}}</w:t>
+              <w:t>{PORTFOLIO_OR_PRODUCT_1}</w:t>
             </w:r>
           </w:p>
         </w:tc>
@@ -12359,7 +12359,7 @@
                 <w:sz w:val="13"/>
                 <w:highlight w:val="yellow"/>
               </w:rPr>
-              <w:t>{{OPENING_FUM}}</w:t>
+              <w:t>{OPENING_FUM}</w:t>
             </w:r>
           </w:p>
         </w:tc>
@@ -12393,7 +12393,7 @@
                 <w:sz w:val="13"/>
                 <w:highlight w:val="yellow"/>
               </w:rPr>
-              <w:t>{{INFLOWS}}</w:t>
+              <w:t>{INFLOWS}</w:t>
             </w:r>
           </w:p>
         </w:tc>
@@ -12427,7 +12427,7 @@
                 <w:sz w:val="13"/>
                 <w:highlight w:val="yellow"/>
               </w:rPr>
-              <w:t>{{OUTFLOWS}}</w:t>
+              <w:t>{OUTFLOWS}</w:t>
             </w:r>
           </w:p>
         </w:tc>
@@ -12461,7 +12461,7 @@
                 <w:sz w:val="13"/>
                 <w:highlight w:val="yellow"/>
               </w:rPr>
-              <w:t>{{MARKET_FX_MOVEMENT}}</w:t>
+              <w:t>{MARKET_FX_MOVEMENT}</w:t>
             </w:r>
           </w:p>
         </w:tc>
@@ -12495,7 +12495,7 @@
                 <w:sz w:val="13"/>
                 <w:highlight w:val="yellow"/>
               </w:rPr>
-              <w:t>{{FEES_CHARGES}}</w:t>
+              <w:t>{FEES_CHARGES}</w:t>
             </w:r>
           </w:p>
         </w:tc>
@@ -12529,7 +12529,7 @@
                 <w:sz w:val="13"/>
                 <w:highlight w:val="yellow"/>
               </w:rPr>
-              <w:t>{{CLOSING_FUM}}</w:t>
+              <w:t>{CLOSING_FUM}</w:t>
             </w:r>
           </w:p>
         </w:tc>
@@ -12563,7 +12563,7 @@
                 <w:sz w:val="13"/>
                 <w:highlight w:val="yellow"/>
               </w:rPr>
-              <w:t>{{CUSTODIAN_REF}}</w:t>
+              <w:t>{CUSTODIAN_REF}</w:t>
             </w:r>
           </w:p>
         </w:tc>
@@ -12598,7 +12598,7 @@
                 <w:sz w:val="13"/>
                 <w:highlight w:val="yellow"/>
               </w:rPr>
-              <w:t>{{PORTFOLIO_OR_PRODUCT_2}}</w:t>
+              <w:t>{PORTFOLIO_OR_PRODUCT_2}</w:t>
             </w:r>
           </w:p>
         </w:tc>
@@ -12631,7 +12631,7 @@
                 <w:sz w:val="13"/>
                 <w:highlight w:val="yellow"/>
               </w:rPr>
-              <w:t>{{OPENING_FUM}}</w:t>
+              <w:t>{OPENING_FUM}</w:t>
             </w:r>
           </w:p>
         </w:tc>
@@ -12664,7 +12664,7 @@
                 <w:sz w:val="13"/>
                 <w:highlight w:val="yellow"/>
               </w:rPr>
-              <w:t>{{INFLOWS}}</w:t>
+              <w:t>{INFLOWS}</w:t>
             </w:r>
           </w:p>
         </w:tc>
@@ -12697,7 +12697,7 @@
                 <w:sz w:val="13"/>
                 <w:highlight w:val="yellow"/>
               </w:rPr>
-              <w:t>{{OUTFLOWS}}</w:t>
+              <w:t>{OUTFLOWS}</w:t>
             </w:r>
           </w:p>
         </w:tc>
@@ -12730,7 +12730,7 @@
                 <w:sz w:val="13"/>
                 <w:highlight w:val="yellow"/>
               </w:rPr>
-              <w:t>{{MARKET_FX_MOVEMENT}}</w:t>
+              <w:t>{MARKET_FX_MOVEMENT}</w:t>
             </w:r>
           </w:p>
         </w:tc>
@@ -12763,7 +12763,7 @@
                 <w:sz w:val="13"/>
                 <w:highlight w:val="yellow"/>
               </w:rPr>
-              <w:t>{{FEES_CHARGES}}</w:t>
+              <w:t>{FEES_CHARGES}</w:t>
             </w:r>
           </w:p>
         </w:tc>
@@ -12796,7 +12796,7 @@
                 <w:sz w:val="13"/>
                 <w:highlight w:val="yellow"/>
               </w:rPr>
-              <w:t>{{CLOSING_FUM}}</w:t>
+              <w:t>{CLOSING_FUM}</w:t>
             </w:r>
           </w:p>
         </w:tc>
@@ -12829,7 +12829,7 @@
                 <w:sz w:val="13"/>
                 <w:highlight w:val="yellow"/>
               </w:rPr>
-              <w:t>{{CUSTODIAN_REF}}</w:t>
+              <w:t>{CUSTODIAN_REF}</w:t>
             </w:r>
           </w:p>
         </w:tc>
@@ -12865,7 +12865,7 @@
                 <w:sz w:val="13"/>
                 <w:highlight w:val="yellow"/>
               </w:rPr>
-              <w:t>{{PORTFOLIO_OR_PRODUCT_3}}</w:t>
+              <w:t>{PORTFOLIO_OR_PRODUCT_3}</w:t>
             </w:r>
           </w:p>
         </w:tc>
@@ -12899,7 +12899,7 @@
                 <w:sz w:val="13"/>
                 <w:highlight w:val="yellow"/>
               </w:rPr>
-              <w:t>{{OPENING_FUM}}</w:t>
+              <w:t>{OPENING_FUM}</w:t>
             </w:r>
           </w:p>
         </w:tc>
@@ -12933,7 +12933,7 @@
                 <w:sz w:val="13"/>
                 <w:highlight w:val="yellow"/>
               </w:rPr>
-              <w:t>{{INFLOWS}}</w:t>
+              <w:t>{INFLOWS}</w:t>
             </w:r>
           </w:p>
         </w:tc>
@@ -12967,7 +12967,7 @@
                 <w:sz w:val="13"/>
                 <w:highlight w:val="yellow"/>
               </w:rPr>
-              <w:t>{{OUTFLOWS}}</w:t>
+              <w:t>{OUTFLOWS}</w:t>
             </w:r>
           </w:p>
         </w:tc>
@@ -13001,7 +13001,7 @@
                 <w:sz w:val="13"/>
                 <w:highlight w:val="yellow"/>
               </w:rPr>
-              <w:t>{{MARKET_FX_MOVEMENT}}</w:t>
+              <w:t>{MARKET_FX_MOVEMENT}</w:t>
             </w:r>
           </w:p>
         </w:tc>
@@ -13035,7 +13035,7 @@
                 <w:sz w:val="13"/>
                 <w:highlight w:val="yellow"/>
               </w:rPr>
-              <w:t>{{FEES_CHARGES}}</w:t>
+              <w:t>{FEES_CHARGES}</w:t>
             </w:r>
           </w:p>
         </w:tc>
@@ -13069,7 +13069,7 @@
                 <w:sz w:val="13"/>
                 <w:highlight w:val="yellow"/>
               </w:rPr>
-              <w:t>{{CLOSING_FUM}}</w:t>
+              <w:t>{CLOSING_FUM}</w:t>
             </w:r>
           </w:p>
         </w:tc>
@@ -13103,7 +13103,7 @@
                 <w:sz w:val="13"/>
                 <w:highlight w:val="yellow"/>
               </w:rPr>
-              <w:t>{{CUSTODIAN_REF}}</w:t>
+              <w:t>{CUSTODIAN_REF}</w:t>
             </w:r>
           </w:p>
         </w:tc>
@@ -13171,7 +13171,7 @@
                 <w:sz w:val="13"/>
                 <w:highlight w:val="yellow"/>
               </w:rPr>
-              <w:t>{{TOTAL_OPENING_FUM}}</w:t>
+              <w:t>{TOTAL_OPENING_FUM}</w:t>
             </w:r>
           </w:p>
         </w:tc>
@@ -13204,7 +13204,7 @@
                 <w:sz w:val="13"/>
                 <w:highlight w:val="yellow"/>
               </w:rPr>
-              <w:t>{{TOTAL_INFLOWS}}</w:t>
+              <w:t>{TOTAL_INFLOWS}</w:t>
             </w:r>
           </w:p>
         </w:tc>
@@ -13237,7 +13237,7 @@
                 <w:sz w:val="13"/>
                 <w:highlight w:val="yellow"/>
               </w:rPr>
-              <w:t>{{TOTAL_OUTFLOWS}}</w:t>
+              <w:t>{TOTAL_OUTFLOWS}</w:t>
             </w:r>
           </w:p>
         </w:tc>
@@ -13270,7 +13270,7 @@
                 <w:sz w:val="13"/>
                 <w:highlight w:val="yellow"/>
               </w:rPr>
-              <w:t>{{TOTAL_MARKET_FX_MOVEMENT}}</w:t>
+              <w:t>{TOTAL_MARKET_FX_MOVEMENT}</w:t>
             </w:r>
           </w:p>
         </w:tc>
@@ -13303,7 +13303,7 @@
                 <w:sz w:val="13"/>
                 <w:highlight w:val="yellow"/>
               </w:rPr>
-              <w:t>{{TOTAL_FEES_CHARGES}}</w:t>
+              <w:t>{TOTAL_FEES_CHARGES}</w:t>
             </w:r>
           </w:p>
         </w:tc>
@@ -13336,7 +13336,7 @@
                 <w:sz w:val="13"/>
                 <w:highlight w:val="yellow"/>
               </w:rPr>
-              <w:t>{{TOTAL_CLOSING_FUM}}</w:t>
+              <w:t>{TOTAL_CLOSING_FUM}</w:t>
             </w:r>
           </w:p>
         </w:tc>
@@ -13369,7 +13369,7 @@
                 <w:sz w:val="13"/>
                 <w:highlight w:val="yellow"/>
               </w:rPr>
-              <w:t>{{RECON_REF}}</w:t>
+              <w:t>{RECON_REF}</w:t>
             </w:r>
           </w:p>
         </w:tc>
@@ -13649,7 +13649,7 @@
                 <w:sz w:val="14"/>
                 <w:highlight w:val="yellow"/>
               </w:rPr>
-              <w:t>{{CASH_DEMAND_DEPOSITS}}</w:t>
+              <w:t>{CASH_DEMAND_DEPOSITS}</w:t>
             </w:r>
           </w:p>
         </w:tc>
@@ -13683,7 +13683,7 @@
                 <w:sz w:val="14"/>
                 <w:highlight w:val="yellow"/>
               </w:rPr>
-              <w:t>{{PERCENT_TOTAL_ASSETS}}</w:t>
+              <w:t>{PERCENT_TOTAL_ASSETS}</w:t>
             </w:r>
           </w:p>
         </w:tc>
@@ -13717,7 +13717,7 @@
                 <w:sz w:val="14"/>
                 <w:highlight w:val="yellow"/>
               </w:rPr>
-              <w:t>{{ELIGIBLE_EXCLUDED}}</w:t>
+              <w:t>{ELIGIBLE_EXCLUDED}</w:t>
             </w:r>
           </w:p>
         </w:tc>
@@ -13751,7 +13751,7 @@
                 <w:sz w:val="14"/>
                 <w:highlight w:val="yellow"/>
               </w:rPr>
-              <w:t>{{COMMENT}}</w:t>
+              <w:t>{COMMENT}</w:t>
             </w:r>
           </w:p>
         </w:tc>
@@ -13819,7 +13819,7 @@
                 <w:sz w:val="14"/>
                 <w:highlight w:val="yellow"/>
               </w:rPr>
-              <w:t>{{MONEY_MARKET_AMOUNT}}</w:t>
+              <w:t>{MONEY_MARKET_AMOUNT}</w:t>
             </w:r>
           </w:p>
         </w:tc>
@@ -13852,7 +13852,7 @@
                 <w:sz w:val="14"/>
                 <w:highlight w:val="yellow"/>
               </w:rPr>
-              <w:t>{{PERCENT_TOTAL_ASSETS}}</w:t>
+              <w:t>{PERCENT_TOTAL_ASSETS}</w:t>
             </w:r>
           </w:p>
         </w:tc>
@@ -13885,7 +13885,7 @@
                 <w:sz w:val="14"/>
                 <w:highlight w:val="yellow"/>
               </w:rPr>
-              <w:t>{{ELIGIBLE_EXCLUDED}}</w:t>
+              <w:t>{ELIGIBLE_EXCLUDED}</w:t>
             </w:r>
           </w:p>
         </w:tc>
@@ -13918,7 +13918,7 @@
                 <w:sz w:val="14"/>
                 <w:highlight w:val="yellow"/>
               </w:rPr>
-              <w:t>{{COMMENT}}</w:t>
+              <w:t>{COMMENT}</w:t>
             </w:r>
           </w:p>
         </w:tc>
@@ -13988,7 +13988,7 @@
                 <w:sz w:val="14"/>
                 <w:highlight w:val="yellow"/>
               </w:rPr>
-              <w:t>{{LISTED_SECURITIES_AMOUNT}}</w:t>
+              <w:t>{LISTED_SECURITIES_AMOUNT}</w:t>
             </w:r>
           </w:p>
         </w:tc>
@@ -14022,7 +14022,7 @@
                 <w:sz w:val="14"/>
                 <w:highlight w:val="yellow"/>
               </w:rPr>
-              <w:t>{{PERCENT_TOTAL_ASSETS}}</w:t>
+              <w:t>{PERCENT_TOTAL_ASSETS}</w:t>
             </w:r>
           </w:p>
         </w:tc>
@@ -14056,7 +14056,7 @@
                 <w:sz w:val="14"/>
                 <w:highlight w:val="yellow"/>
               </w:rPr>
-              <w:t>{{ELIGIBLE_EXCLUDED}}</w:t>
+              <w:t>{ELIGIBLE_EXCLUDED}</w:t>
             </w:r>
           </w:p>
         </w:tc>
@@ -14090,7 +14090,7 @@
                 <w:sz w:val="14"/>
                 <w:highlight w:val="yellow"/>
               </w:rPr>
-              <w:t>{{COMMENT}}</w:t>
+              <w:t>{COMMENT}</w:t>
             </w:r>
           </w:p>
         </w:tc>
@@ -14158,7 +14158,7 @@
                 <w:sz w:val="14"/>
                 <w:highlight w:val="yellow"/>
               </w:rPr>
-              <w:t>{{ELIGIBLE_RECEIVABLES}}</w:t>
+              <w:t>{ELIGIBLE_RECEIVABLES}</w:t>
             </w:r>
           </w:p>
         </w:tc>
@@ -14191,7 +14191,7 @@
                 <w:sz w:val="14"/>
                 <w:highlight w:val="yellow"/>
               </w:rPr>
-              <w:t>{{PERCENT_TOTAL_ASSETS}}</w:t>
+              <w:t>{PERCENT_TOTAL_ASSETS}</w:t>
             </w:r>
           </w:p>
         </w:tc>
@@ -14224,7 +14224,7 @@
                 <w:sz w:val="14"/>
                 <w:highlight w:val="yellow"/>
               </w:rPr>
-              <w:t>{{ELIGIBLE_EXCLUDED}}</w:t>
+              <w:t>{ELIGIBLE_EXCLUDED}</w:t>
             </w:r>
           </w:p>
         </w:tc>
@@ -14257,7 +14257,7 @@
                 <w:sz w:val="14"/>
                 <w:highlight w:val="yellow"/>
               </w:rPr>
-              <w:t>{{COMMENT}}</w:t>
+              <w:t>{COMMENT}</w:t>
             </w:r>
           </w:p>
         </w:tc>
@@ -14327,7 +14327,7 @@
                 <w:sz w:val="14"/>
                 <w:highlight w:val="yellow"/>
               </w:rPr>
-              <w:t>{{ILLIQUID_RESTRICTED_ASSETS}}</w:t>
+              <w:t>{ILLIQUID_RESTRICTED_ASSETS}</w:t>
             </w:r>
           </w:p>
         </w:tc>
@@ -14361,7 +14361,7 @@
                 <w:sz w:val="14"/>
                 <w:highlight w:val="yellow"/>
               </w:rPr>
-              <w:t>{{PERCENT_TOTAL_ASSETS}}</w:t>
+              <w:t>{PERCENT_TOTAL_ASSETS}</w:t>
             </w:r>
           </w:p>
         </w:tc>
@@ -14395,7 +14395,7 @@
                 <w:sz w:val="14"/>
                 <w:highlight w:val="yellow"/>
               </w:rPr>
-              <w:t>{{ELIGIBLE_EXCLUDED}}</w:t>
+              <w:t>{ELIGIBLE_EXCLUDED}</w:t>
             </w:r>
           </w:p>
         </w:tc>
@@ -14429,7 +14429,7 @@
                 <w:sz w:val="14"/>
                 <w:highlight w:val="yellow"/>
               </w:rPr>
-              <w:t>{{COMMENT}}</w:t>
+              <w:t>{COMMENT}</w:t>
             </w:r>
           </w:p>
         </w:tc>
@@ -14497,7 +14497,7 @@
                 <w:sz w:val="14"/>
                 <w:highlight w:val="yellow"/>
               </w:rPr>
-              <w:t>{{TOTAL_LIQUID_RESOURCES}}</w:t>
+              <w:t>{TOTAL_LIQUID_RESOURCES}</w:t>
             </w:r>
           </w:p>
         </w:tc>
@@ -14530,7 +14530,7 @@
                 <w:sz w:val="14"/>
                 <w:highlight w:val="yellow"/>
               </w:rPr>
-              <w:t>{{PERCENT_TOTAL_ASSETS}}</w:t>
+              <w:t>{PERCENT_TOTAL_ASSETS}</w:t>
             </w:r>
           </w:p>
         </w:tc>
@@ -14563,7 +14563,7 @@
                 <w:sz w:val="14"/>
                 <w:highlight w:val="yellow"/>
               </w:rPr>
-              <w:t>{{ELIGIBLE_EXCLUDED}}</w:t>
+              <w:t>{ELIGIBLE_EXCLUDED}</w:t>
             </w:r>
           </w:p>
         </w:tc>
@@ -14596,7 +14596,7 @@
                 <w:sz w:val="14"/>
                 <w:highlight w:val="yellow"/>
               </w:rPr>
-              <w:t>{{COMMENT}}</w:t>
+              <w:t>{COMMENT}</w:t>
             </w:r>
           </w:p>
         </w:tc>
@@ -14984,7 +14984,7 @@
                 <w:sz w:val="13"/>
                 <w:highlight w:val="yellow"/>
               </w:rPr>
-              <w:t>{{AMOUNT}}</w:t>
+              <w:t>{AMOUNT}</w:t>
             </w:r>
           </w:p>
         </w:tc>
@@ -15018,7 +15018,7 @@
                 <w:sz w:val="13"/>
                 <w:highlight w:val="yellow"/>
               </w:rPr>
-              <w:t>{{AMOUNT}}</w:t>
+              <w:t>{AMOUNT}</w:t>
             </w:r>
           </w:p>
         </w:tc>
@@ -15052,7 +15052,7 @@
                 <w:sz w:val="13"/>
                 <w:highlight w:val="yellow"/>
               </w:rPr>
-              <w:t>{{AMOUNT}}</w:t>
+              <w:t>{AMOUNT}</w:t>
             </w:r>
           </w:p>
         </w:tc>
@@ -15086,7 +15086,7 @@
                 <w:sz w:val="13"/>
                 <w:highlight w:val="yellow"/>
               </w:rPr>
-              <w:t>{{AMOUNT}}</w:t>
+              <w:t>{AMOUNT}</w:t>
             </w:r>
           </w:p>
         </w:tc>
@@ -15120,7 +15120,7 @@
                 <w:sz w:val="13"/>
                 <w:highlight w:val="yellow"/>
               </w:rPr>
-              <w:t>{{TOTAL}}</w:t>
+              <w:t>{TOTAL}</w:t>
             </w:r>
           </w:p>
         </w:tc>
@@ -15154,7 +15154,7 @@
                 <w:sz w:val="13"/>
                 <w:highlight w:val="yellow"/>
               </w:rPr>
-              <w:t>{{PROVISION}}</w:t>
+              <w:t>{PROVISION}</w:t>
             </w:r>
           </w:p>
         </w:tc>
@@ -15188,7 +15188,7 @@
                 <w:sz w:val="13"/>
                 <w:highlight w:val="yellow"/>
               </w:rPr>
-              <w:t>{{COMMENT}}</w:t>
+              <w:t>{COMMENT}</w:t>
             </w:r>
           </w:p>
         </w:tc>
@@ -15256,7 +15256,7 @@
                 <w:sz w:val="13"/>
                 <w:highlight w:val="yellow"/>
               </w:rPr>
-              <w:t>{{AMOUNT}}</w:t>
+              <w:t>{AMOUNT}</w:t>
             </w:r>
           </w:p>
         </w:tc>
@@ -15289,7 +15289,7 @@
                 <w:sz w:val="13"/>
                 <w:highlight w:val="yellow"/>
               </w:rPr>
-              <w:t>{{AMOUNT}}</w:t>
+              <w:t>{AMOUNT}</w:t>
             </w:r>
           </w:p>
         </w:tc>
@@ -15322,7 +15322,7 @@
                 <w:sz w:val="13"/>
                 <w:highlight w:val="yellow"/>
               </w:rPr>
-              <w:t>{{AMOUNT}}</w:t>
+              <w:t>{AMOUNT}</w:t>
             </w:r>
           </w:p>
         </w:tc>
@@ -15355,7 +15355,7 @@
                 <w:sz w:val="13"/>
                 <w:highlight w:val="yellow"/>
               </w:rPr>
-              <w:t>{{AMOUNT}}</w:t>
+              <w:t>{AMOUNT}</w:t>
             </w:r>
           </w:p>
         </w:tc>
@@ -15388,7 +15388,7 @@
                 <w:sz w:val="13"/>
                 <w:highlight w:val="yellow"/>
               </w:rPr>
-              <w:t>{{TOTAL}}</w:t>
+              <w:t>{TOTAL}</w:t>
             </w:r>
           </w:p>
         </w:tc>
@@ -15421,7 +15421,7 @@
                 <w:sz w:val="13"/>
                 <w:highlight w:val="yellow"/>
               </w:rPr>
-              <w:t>{{PROVISION}}</w:t>
+              <w:t>{PROVISION}</w:t>
             </w:r>
           </w:p>
         </w:tc>
@@ -15454,7 +15454,7 @@
                 <w:sz w:val="13"/>
                 <w:highlight w:val="yellow"/>
               </w:rPr>
-              <w:t>{{COMMENT}}</w:t>
+              <w:t>{COMMENT}</w:t>
             </w:r>
           </w:p>
         </w:tc>
@@ -15524,7 +15524,7 @@
                 <w:sz w:val="13"/>
                 <w:highlight w:val="yellow"/>
               </w:rPr>
-              <w:t>{{AMOUNT}}</w:t>
+              <w:t>{AMOUNT}</w:t>
             </w:r>
           </w:p>
         </w:tc>
@@ -15558,7 +15558,7 @@
                 <w:sz w:val="13"/>
                 <w:highlight w:val="yellow"/>
               </w:rPr>
-              <w:t>{{AMOUNT}}</w:t>
+              <w:t>{AMOUNT}</w:t>
             </w:r>
           </w:p>
         </w:tc>
@@ -15592,7 +15592,7 @@
                 <w:sz w:val="13"/>
                 <w:highlight w:val="yellow"/>
               </w:rPr>
-              <w:t>{{AMOUNT}}</w:t>
+              <w:t>{AMOUNT}</w:t>
             </w:r>
           </w:p>
         </w:tc>
@@ -15626,7 +15626,7 @@
                 <w:sz w:val="13"/>
                 <w:highlight w:val="yellow"/>
               </w:rPr>
-              <w:t>{{AMOUNT}}</w:t>
+              <w:t>{AMOUNT}</w:t>
             </w:r>
           </w:p>
         </w:tc>
@@ -15660,7 +15660,7 @@
                 <w:sz w:val="13"/>
                 <w:highlight w:val="yellow"/>
               </w:rPr>
-              <w:t>{{TOTAL}}</w:t>
+              <w:t>{TOTAL}</w:t>
             </w:r>
           </w:p>
         </w:tc>
@@ -15694,7 +15694,7 @@
                 <w:sz w:val="13"/>
                 <w:highlight w:val="yellow"/>
               </w:rPr>
-              <w:t>{{PROVISION}}</w:t>
+              <w:t>{PROVISION}</w:t>
             </w:r>
           </w:p>
         </w:tc>
@@ -15728,7 +15728,7 @@
                 <w:sz w:val="13"/>
                 <w:highlight w:val="yellow"/>
               </w:rPr>
-              <w:t>{{COMMENT}}</w:t>
+              <w:t>{COMMENT}</w:t>
             </w:r>
           </w:p>
         </w:tc>
@@ -15796,7 +15796,7 @@
                 <w:sz w:val="13"/>
                 <w:highlight w:val="yellow"/>
               </w:rPr>
-              <w:t>{{AMOUNT}}</w:t>
+              <w:t>{AMOUNT}</w:t>
             </w:r>
           </w:p>
         </w:tc>
@@ -15829,7 +15829,7 @@
                 <w:sz w:val="13"/>
                 <w:highlight w:val="yellow"/>
               </w:rPr>
-              <w:t>{{AMOUNT}}</w:t>
+              <w:t>{AMOUNT}</w:t>
             </w:r>
           </w:p>
         </w:tc>
@@ -15862,7 +15862,7 @@
                 <w:sz w:val="13"/>
                 <w:highlight w:val="yellow"/>
               </w:rPr>
-              <w:t>{{AMOUNT}}</w:t>
+              <w:t>{AMOUNT}</w:t>
             </w:r>
           </w:p>
         </w:tc>
@@ -15895,7 +15895,7 @@
                 <w:sz w:val="13"/>
                 <w:highlight w:val="yellow"/>
               </w:rPr>
-              <w:t>{{AMOUNT}}</w:t>
+              <w:t>{AMOUNT}</w:t>
             </w:r>
           </w:p>
         </w:tc>
@@ -15928,7 +15928,7 @@
                 <w:sz w:val="13"/>
                 <w:highlight w:val="yellow"/>
               </w:rPr>
-              <w:t>{{TOTAL}}</w:t>
+              <w:t>{TOTAL}</w:t>
             </w:r>
           </w:p>
         </w:tc>
@@ -15961,7 +15961,7 @@
                 <w:sz w:val="13"/>
                 <w:highlight w:val="yellow"/>
               </w:rPr>
-              <w:t>{{N_A}}</w:t>
+              <w:t>{N_A}</w:t>
             </w:r>
           </w:p>
         </w:tc>
@@ -15994,7 +15994,7 @@
                 <w:sz w:val="13"/>
                 <w:highlight w:val="yellow"/>
               </w:rPr>
-              <w:t>{{COMMENT}}</w:t>
+              <w:t>{COMMENT}</w:t>
             </w:r>
           </w:p>
         </w:tc>
@@ -16064,7 +16064,7 @@
                 <w:sz w:val="13"/>
                 <w:highlight w:val="yellow"/>
               </w:rPr>
-              <w:t>{{AMOUNT}}</w:t>
+              <w:t>{AMOUNT}</w:t>
             </w:r>
           </w:p>
         </w:tc>
@@ -16098,7 +16098,7 @@
                 <w:sz w:val="13"/>
                 <w:highlight w:val="yellow"/>
               </w:rPr>
-              <w:t>{{AMOUNT}}</w:t>
+              <w:t>{AMOUNT}</w:t>
             </w:r>
           </w:p>
         </w:tc>
@@ -16132,7 +16132,7 @@
                 <w:sz w:val="13"/>
                 <w:highlight w:val="yellow"/>
               </w:rPr>
-              <w:t>{{AMOUNT}}</w:t>
+              <w:t>{AMOUNT}</w:t>
             </w:r>
           </w:p>
         </w:tc>
@@ -16166,7 +16166,7 @@
                 <w:sz w:val="13"/>
                 <w:highlight w:val="yellow"/>
               </w:rPr>
-              <w:t>{{AMOUNT}}</w:t>
+              <w:t>{AMOUNT}</w:t>
             </w:r>
           </w:p>
         </w:tc>
@@ -16200,7 +16200,7 @@
                 <w:sz w:val="13"/>
                 <w:highlight w:val="yellow"/>
               </w:rPr>
-              <w:t>{{TOTAL}}</w:t>
+              <w:t>{TOTAL}</w:t>
             </w:r>
           </w:p>
         </w:tc>
@@ -16234,7 +16234,7 @@
                 <w:sz w:val="13"/>
                 <w:highlight w:val="yellow"/>
               </w:rPr>
-              <w:t>{{N_A}}</w:t>
+              <w:t>{N_A}</w:t>
             </w:r>
           </w:p>
         </w:tc>
@@ -16268,7 +16268,7 @@
                 <w:sz w:val="13"/>
                 <w:highlight w:val="yellow"/>
               </w:rPr>
-              <w:t>{{COMMENT}}</w:t>
+              <w:t>{COMMENT}</w:t>
             </w:r>
           </w:p>
         </w:tc>
@@ -16676,7 +16676,7 @@
                 <w:sz w:val="13"/>
                 <w:highlight w:val="yellow"/>
               </w:rPr>
-              <w:t>{{LISTED_EQUITIES_VALUE}}</w:t>
+              <w:t>{LISTED_EQUITIES_VALUE}</w:t>
             </w:r>
           </w:p>
         </w:tc>
@@ -16710,7 +16710,7 @@
                 <w:sz w:val="13"/>
                 <w:highlight w:val="yellow"/>
               </w:rPr>
-              <w:t>{{PERCENT_FUM}}</w:t>
+              <w:t>{PERCENT_FUM}</w:t>
             </w:r>
           </w:p>
         </w:tc>
@@ -16744,7 +16744,7 @@
                 <w:sz w:val="13"/>
                 <w:highlight w:val="yellow"/>
               </w:rPr>
-              <w:t>{{COUNT}}</w:t>
+              <w:t>{COUNT}</w:t>
             </w:r>
           </w:p>
         </w:tc>
@@ -16778,7 +16778,7 @@
                 <w:sz w:val="13"/>
                 <w:highlight w:val="yellow"/>
               </w:rPr>
-              <w:t>{{LARGEST_ISSUER}}</w:t>
+              <w:t>{LARGEST_ISSUER}</w:t>
             </w:r>
           </w:p>
         </w:tc>
@@ -16812,7 +16812,7 @@
                 <w:sz w:val="13"/>
                 <w:highlight w:val="yellow"/>
               </w:rPr>
-              <w:t>{{LIMIT}}</w:t>
+              <w:t>{LIMIT}</w:t>
             </w:r>
           </w:p>
         </w:tc>
@@ -16846,7 +16846,7 @@
                 <w:sz w:val="13"/>
                 <w:highlight w:val="yellow"/>
               </w:rPr>
-              <w:t>{{BREACH_EXCEPTION}}</w:t>
+              <w:t>{BREACH_EXCEPTION}</w:t>
             </w:r>
           </w:p>
         </w:tc>
@@ -16914,7 +16914,7 @@
                 <w:sz w:val="13"/>
                 <w:highlight w:val="yellow"/>
               </w:rPr>
-              <w:t>{{UNQUOTED_EQUITIES_VALUE}}</w:t>
+              <w:t>{UNQUOTED_EQUITIES_VALUE}</w:t>
             </w:r>
           </w:p>
         </w:tc>
@@ -16947,7 +16947,7 @@
                 <w:sz w:val="13"/>
                 <w:highlight w:val="yellow"/>
               </w:rPr>
-              <w:t>{{PERCENT_FUM}}</w:t>
+              <w:t>{PERCENT_FUM}</w:t>
             </w:r>
           </w:p>
         </w:tc>
@@ -16980,7 +16980,7 @@
                 <w:sz w:val="13"/>
                 <w:highlight w:val="yellow"/>
               </w:rPr>
-              <w:t>{{COUNT}}</w:t>
+              <w:t>{COUNT}</w:t>
             </w:r>
           </w:p>
         </w:tc>
@@ -17013,7 +17013,7 @@
                 <w:sz w:val="13"/>
                 <w:highlight w:val="yellow"/>
               </w:rPr>
-              <w:t>{{LARGEST_ISSUER}}</w:t>
+              <w:t>{LARGEST_ISSUER}</w:t>
             </w:r>
           </w:p>
         </w:tc>
@@ -17046,7 +17046,7 @@
                 <w:sz w:val="13"/>
                 <w:highlight w:val="yellow"/>
               </w:rPr>
-              <w:t>{{LIMIT}}</w:t>
+              <w:t>{LIMIT}</w:t>
             </w:r>
           </w:p>
         </w:tc>
@@ -17079,7 +17079,7 @@
                 <w:sz w:val="13"/>
                 <w:highlight w:val="yellow"/>
               </w:rPr>
-              <w:t>{{BREACH_EXCEPTION}}</w:t>
+              <w:t>{BREACH_EXCEPTION}</w:t>
             </w:r>
           </w:p>
         </w:tc>
@@ -17149,7 +17149,7 @@
                 <w:sz w:val="13"/>
                 <w:highlight w:val="yellow"/>
               </w:rPr>
-              <w:t>{{MONEY_MARKET_VALUE}}</w:t>
+              <w:t>{MONEY_MARKET_VALUE}</w:t>
             </w:r>
           </w:p>
         </w:tc>
@@ -17183,7 +17183,7 @@
                 <w:sz w:val="13"/>
                 <w:highlight w:val="yellow"/>
               </w:rPr>
-              <w:t>{{PERCENT_FUM}}</w:t>
+              <w:t>{PERCENT_FUM}</w:t>
             </w:r>
           </w:p>
         </w:tc>
@@ -17217,7 +17217,7 @@
                 <w:sz w:val="13"/>
                 <w:highlight w:val="yellow"/>
               </w:rPr>
-              <w:t>{{COUNT}}</w:t>
+              <w:t>{COUNT}</w:t>
             </w:r>
           </w:p>
         </w:tc>
@@ -17251,7 +17251,7 @@
                 <w:sz w:val="13"/>
                 <w:highlight w:val="yellow"/>
               </w:rPr>
-              <w:t>{{LARGEST_ISSUER}}</w:t>
+              <w:t>{LARGEST_ISSUER}</w:t>
             </w:r>
           </w:p>
         </w:tc>
@@ -17285,7 +17285,7 @@
                 <w:sz w:val="13"/>
                 <w:highlight w:val="yellow"/>
               </w:rPr>
-              <w:t>{{LIMIT}}</w:t>
+              <w:t>{LIMIT}</w:t>
             </w:r>
           </w:p>
         </w:tc>
@@ -17319,7 +17319,7 @@
                 <w:sz w:val="13"/>
                 <w:highlight w:val="yellow"/>
               </w:rPr>
-              <w:t>{{BREACH_EXCEPTION}}</w:t>
+              <w:t>{BREACH_EXCEPTION}</w:t>
             </w:r>
           </w:p>
         </w:tc>
@@ -17387,7 +17387,7 @@
                 <w:sz w:val="13"/>
                 <w:highlight w:val="yellow"/>
               </w:rPr>
-              <w:t>{{BONDS_VALUE}}</w:t>
+              <w:t>{BONDS_VALUE}</w:t>
             </w:r>
           </w:p>
         </w:tc>
@@ -17420,7 +17420,7 @@
                 <w:sz w:val="13"/>
                 <w:highlight w:val="yellow"/>
               </w:rPr>
-              <w:t>{{PERCENT_FUM}}</w:t>
+              <w:t>{PERCENT_FUM}</w:t>
             </w:r>
           </w:p>
         </w:tc>
@@ -17453,7 +17453,7 @@
                 <w:sz w:val="13"/>
                 <w:highlight w:val="yellow"/>
               </w:rPr>
-              <w:t>{{COUNT}}</w:t>
+              <w:t>{COUNT}</w:t>
             </w:r>
           </w:p>
         </w:tc>
@@ -17486,7 +17486,7 @@
                 <w:sz w:val="13"/>
                 <w:highlight w:val="yellow"/>
               </w:rPr>
-              <w:t>{{LARGEST_ISSUER}}</w:t>
+              <w:t>{LARGEST_ISSUER}</w:t>
             </w:r>
           </w:p>
         </w:tc>
@@ -17519,7 +17519,7 @@
                 <w:sz w:val="13"/>
                 <w:highlight w:val="yellow"/>
               </w:rPr>
-              <w:t>{{LIMIT}}</w:t>
+              <w:t>{LIMIT}</w:t>
             </w:r>
           </w:p>
         </w:tc>
@@ -17552,7 +17552,7 @@
                 <w:sz w:val="13"/>
                 <w:highlight w:val="yellow"/>
               </w:rPr>
-              <w:t>{{BREACH_EXCEPTION}}</w:t>
+              <w:t>{BREACH_EXCEPTION}</w:t>
             </w:r>
           </w:p>
         </w:tc>
@@ -17622,7 +17622,7 @@
                 <w:sz w:val="13"/>
                 <w:highlight w:val="yellow"/>
               </w:rPr>
-              <w:t>{{PROPERTY_REIT_VALUE}}</w:t>
+              <w:t>{PROPERTY_REIT_VALUE}</w:t>
             </w:r>
           </w:p>
         </w:tc>
@@ -17656,7 +17656,7 @@
                 <w:sz w:val="13"/>
                 <w:highlight w:val="yellow"/>
               </w:rPr>
-              <w:t>{{PERCENT_FUM}}</w:t>
+              <w:t>{PERCENT_FUM}</w:t>
             </w:r>
           </w:p>
         </w:tc>
@@ -17690,7 +17690,7 @@
                 <w:sz w:val="13"/>
                 <w:highlight w:val="yellow"/>
               </w:rPr>
-              <w:t>{{COUNT}}</w:t>
+              <w:t>{COUNT}</w:t>
             </w:r>
           </w:p>
         </w:tc>
@@ -17724,7 +17724,7 @@
                 <w:sz w:val="13"/>
                 <w:highlight w:val="yellow"/>
               </w:rPr>
-              <w:t>{{LARGEST_ISSUER}}</w:t>
+              <w:t>{LARGEST_ISSUER}</w:t>
             </w:r>
           </w:p>
         </w:tc>
@@ -17758,7 +17758,7 @@
                 <w:sz w:val="13"/>
                 <w:highlight w:val="yellow"/>
               </w:rPr>
-              <w:t>{{LIMIT}}</w:t>
+              <w:t>{LIMIT}</w:t>
             </w:r>
           </w:p>
         </w:tc>
@@ -17792,7 +17792,7 @@
                 <w:sz w:val="13"/>
                 <w:highlight w:val="yellow"/>
               </w:rPr>
-              <w:t>{{BREACH_EXCEPTION}}</w:t>
+              <w:t>{BREACH_EXCEPTION}</w:t>
             </w:r>
           </w:p>
         </w:tc>
@@ -17860,7 +17860,7 @@
                 <w:sz w:val="13"/>
                 <w:highlight w:val="yellow"/>
               </w:rPr>
-              <w:t>{{OTHER_INVESTMENTS_VALUE}}</w:t>
+              <w:t>{OTHER_INVESTMENTS_VALUE}</w:t>
             </w:r>
           </w:p>
         </w:tc>
@@ -17893,7 +17893,7 @@
                 <w:sz w:val="13"/>
                 <w:highlight w:val="yellow"/>
               </w:rPr>
-              <w:t>{{PERCENT_FUM}}</w:t>
+              <w:t>{PERCENT_FUM}</w:t>
             </w:r>
           </w:p>
         </w:tc>
@@ -17926,7 +17926,7 @@
                 <w:sz w:val="13"/>
                 <w:highlight w:val="yellow"/>
               </w:rPr>
-              <w:t>{{COUNT}}</w:t>
+              <w:t>{COUNT}</w:t>
             </w:r>
           </w:p>
         </w:tc>
@@ -17959,7 +17959,7 @@
                 <w:sz w:val="13"/>
                 <w:highlight w:val="yellow"/>
               </w:rPr>
-              <w:t>{{LARGEST_ISSUER}}</w:t>
+              <w:t>{LARGEST_ISSUER}</w:t>
             </w:r>
           </w:p>
         </w:tc>
@@ -17992,7 +17992,7 @@
                 <w:sz w:val="13"/>
                 <w:highlight w:val="yellow"/>
               </w:rPr>
-              <w:t>{{LIMIT}}</w:t>
+              <w:t>{LIMIT}</w:t>
             </w:r>
           </w:p>
         </w:tc>
@@ -18025,7 +18025,7 @@
                 <w:sz w:val="13"/>
                 <w:highlight w:val="yellow"/>
               </w:rPr>
-              <w:t>{{BREACH_EXCEPTION}}</w:t>
+              <w:t>{BREACH_EXCEPTION}</w:t>
             </w:r>
           </w:p>
         </w:tc>
@@ -18095,7 +18095,7 @@
                 <w:sz w:val="13"/>
                 <w:highlight w:val="yellow"/>
               </w:rPr>
-              <w:t>{{CASH_DEPOSITS_VALUE}}</w:t>
+              <w:t>{CASH_DEPOSITS_VALUE}</w:t>
             </w:r>
           </w:p>
         </w:tc>
@@ -18129,7 +18129,7 @@
                 <w:sz w:val="13"/>
                 <w:highlight w:val="yellow"/>
               </w:rPr>
-              <w:t>{{PERCENT_FUM}}</w:t>
+              <w:t>{PERCENT_FUM}</w:t>
             </w:r>
           </w:p>
         </w:tc>
@@ -18163,7 +18163,7 @@
                 <w:sz w:val="13"/>
                 <w:highlight w:val="yellow"/>
               </w:rPr>
-              <w:t>{{COUNT}}</w:t>
+              <w:t>{COUNT}</w:t>
             </w:r>
           </w:p>
         </w:tc>
@@ -18197,7 +18197,7 @@
                 <w:sz w:val="13"/>
                 <w:highlight w:val="yellow"/>
               </w:rPr>
-              <w:t>{{LARGEST_BANK}}</w:t>
+              <w:t>{LARGEST_BANK}</w:t>
             </w:r>
           </w:p>
         </w:tc>
@@ -18231,7 +18231,7 @@
                 <w:sz w:val="13"/>
                 <w:highlight w:val="yellow"/>
               </w:rPr>
-              <w:t>{{LIMIT}}</w:t>
+              <w:t>{LIMIT}</w:t>
             </w:r>
           </w:p>
         </w:tc>
@@ -18265,7 +18265,7 @@
                 <w:sz w:val="13"/>
                 <w:highlight w:val="yellow"/>
               </w:rPr>
-              <w:t>{{BREACH_EXCEPTION}}</w:t>
+              <w:t>{BREACH_EXCEPTION}</w:t>
             </w:r>
           </w:p>
         </w:tc>
@@ -18560,7 +18560,7 @@
                 <w:sz w:val="14"/>
                 <w:highlight w:val="yellow"/>
               </w:rPr>
-              <w:t>{{ADJUSTED_LIQUID_CAPITAL}}</w:t>
+              <w:t>{ADJUSTED_LIQUID_CAPITAL}</w:t>
             </w:r>
           </w:p>
         </w:tc>
@@ -18594,7 +18594,7 @@
                 <w:sz w:val="14"/>
                 <w:highlight w:val="yellow"/>
               </w:rPr>
-              <w:t>{{CAPITAL_ADEQUACY_PACK_REF}}</w:t>
+              <w:t>{CAPITAL_ADEQUACY_PACK_REF}</w:t>
             </w:r>
           </w:p>
         </w:tc>
@@ -18628,7 +18628,7 @@
                 <w:sz w:val="14"/>
                 <w:highlight w:val="yellow"/>
               </w:rPr>
-              <w:t>{{MATCHED_EXCEPTION}}</w:t>
+              <w:t>{MATCHED_EXCEPTION}</w:t>
             </w:r>
           </w:p>
         </w:tc>
@@ -18662,7 +18662,7 @@
                 <w:sz w:val="14"/>
                 <w:highlight w:val="yellow"/>
               </w:rPr>
-              <w:t>{{COMMENT}}</w:t>
+              <w:t>{COMMENT}</w:t>
             </w:r>
           </w:p>
         </w:tc>
@@ -18730,7 +18730,7 @@
                 <w:sz w:val="14"/>
                 <w:highlight w:val="yellow"/>
               </w:rPr>
-              <w:t>{{TOTAL_CAPITAL_REQUIREMENT}}</w:t>
+              <w:t>{TOTAL_CAPITAL_REQUIREMENT}</w:t>
             </w:r>
           </w:p>
         </w:tc>
@@ -18763,7 +18763,7 @@
                 <w:sz w:val="14"/>
                 <w:highlight w:val="yellow"/>
               </w:rPr>
-              <w:t>{{CAPITAL_ADEQUACY_PACK_REF}}</w:t>
+              <w:t>{CAPITAL_ADEQUACY_PACK_REF}</w:t>
             </w:r>
           </w:p>
         </w:tc>
@@ -18796,7 +18796,7 @@
                 <w:sz w:val="14"/>
                 <w:highlight w:val="yellow"/>
               </w:rPr>
-              <w:t>{{MATCHED_EXCEPTION}}</w:t>
+              <w:t>{MATCHED_EXCEPTION}</w:t>
             </w:r>
           </w:p>
         </w:tc>
@@ -18829,7 +18829,7 @@
                 <w:sz w:val="14"/>
                 <w:highlight w:val="yellow"/>
               </w:rPr>
-              <w:t>{{COMMENT}}</w:t>
+              <w:t>{COMMENT}</w:t>
             </w:r>
           </w:p>
         </w:tc>
@@ -18899,7 +18899,7 @@
                 <w:sz w:val="14"/>
                 <w:highlight w:val="yellow"/>
               </w:rPr>
-              <w:t>{{CAPITAL_ADEQUACY_RATIO}}</w:t>
+              <w:t>{CAPITAL_ADEQUACY_RATIO}</w:t>
             </w:r>
           </w:p>
         </w:tc>
@@ -18933,7 +18933,7 @@
                 <w:sz w:val="14"/>
                 <w:highlight w:val="yellow"/>
               </w:rPr>
-              <w:t>{{CAPITAL_ADEQUACY_PACK_REF}}</w:t>
+              <w:t>{CAPITAL_ADEQUACY_PACK_REF}</w:t>
             </w:r>
           </w:p>
         </w:tc>
@@ -18967,7 +18967,7 @@
                 <w:sz w:val="14"/>
                 <w:highlight w:val="yellow"/>
               </w:rPr>
-              <w:t>{{MATCHED_EXCEPTION}}</w:t>
+              <w:t>{MATCHED_EXCEPTION}</w:t>
             </w:r>
           </w:p>
         </w:tc>
@@ -19001,7 +19001,7 @@
                 <w:sz w:val="14"/>
                 <w:highlight w:val="yellow"/>
               </w:rPr>
-              <w:t>{{COMMENT}}</w:t>
+              <w:t>{COMMENT}</w:t>
             </w:r>
           </w:p>
         </w:tc>
@@ -19069,7 +19069,7 @@
                 <w:sz w:val="14"/>
                 <w:highlight w:val="yellow"/>
               </w:rPr>
-              <w:t>{{REGULATORY_MINIMUM_THRESHOLD}}</w:t>
+              <w:t>{REGULATORY_MINIMUM_THRESHOLD}</w:t>
             </w:r>
           </w:p>
         </w:tc>
@@ -19102,7 +19102,7 @@
                 <w:sz w:val="14"/>
                 <w:highlight w:val="yellow"/>
               </w:rPr>
-              <w:t>{{POLICY_OR_DIRECTIVE_REF}}</w:t>
+              <w:t>{POLICY_OR_DIRECTIVE_REF}</w:t>
             </w:r>
           </w:p>
         </w:tc>
@@ -19135,7 +19135,7 @@
                 <w:sz w:val="14"/>
                 <w:highlight w:val="yellow"/>
               </w:rPr>
-              <w:t>{{MATCHED_EXCEPTION}}</w:t>
+              <w:t>{MATCHED_EXCEPTION}</w:t>
             </w:r>
           </w:p>
         </w:tc>
@@ -19168,7 +19168,7 @@
                 <w:sz w:val="14"/>
                 <w:highlight w:val="yellow"/>
               </w:rPr>
-              <w:t>{{COMMENT}}</w:t>
+              <w:t>{COMMENT}</w:t>
             </w:r>
           </w:p>
         </w:tc>
@@ -19238,7 +19238,7 @@
                 <w:sz w:val="14"/>
                 <w:highlight w:val="yellow"/>
               </w:rPr>
-              <w:t>{{CAPITAL_BUFFER_OR_SHORTFALL}}</w:t>
+              <w:t>{CAPITAL_BUFFER_OR_SHORTFALL}</w:t>
             </w:r>
           </w:p>
         </w:tc>
@@ -19272,7 +19272,7 @@
                 <w:sz w:val="14"/>
                 <w:highlight w:val="yellow"/>
               </w:rPr>
-              <w:t>{{CAPITAL_ADEQUACY_PACK_REF}}</w:t>
+              <w:t>{CAPITAL_ADEQUACY_PACK_REF}</w:t>
             </w:r>
           </w:p>
         </w:tc>
@@ -19306,7 +19306,7 @@
                 <w:sz w:val="14"/>
                 <w:highlight w:val="yellow"/>
               </w:rPr>
-              <w:t>{{MATCHED_EXCEPTION}}</w:t>
+              <w:t>{MATCHED_EXCEPTION}</w:t>
             </w:r>
           </w:p>
         </w:tc>
@@ -19340,7 +19340,7 @@
                 <w:sz w:val="14"/>
                 <w:highlight w:val="yellow"/>
               </w:rPr>
-              <w:t>{{COMMENT}}</w:t>
+              <w:t>{COMMENT}</w:t>
             </w:r>
           </w:p>
         </w:tc>
@@ -19658,7 +19658,7 @@
                 <w:sz w:val="14"/>
                 <w:highlight w:val="yellow"/>
               </w:rPr>
-              <w:t>{{EXCEPTION_ID_1}}</w:t>
+              <w:t>{EXCEPTION_ID_1}</w:t>
             </w:r>
           </w:p>
         </w:tc>
@@ -19692,7 +19692,7 @@
                 <w:sz w:val="14"/>
                 <w:highlight w:val="yellow"/>
               </w:rPr>
-              <w:t>{{AREA}}</w:t>
+              <w:t>{AREA}</w:t>
             </w:r>
           </w:p>
         </w:tc>
@@ -19726,7 +19726,7 @@
                 <w:sz w:val="14"/>
                 <w:highlight w:val="yellow"/>
               </w:rPr>
-              <w:t>{{DESCRIPTION}}</w:t>
+              <w:t>{DESCRIPTION}</w:t>
             </w:r>
           </w:p>
         </w:tc>
@@ -19760,7 +19760,7 @@
                 <w:sz w:val="14"/>
                 <w:highlight w:val="yellow"/>
               </w:rPr>
-              <w:t>{{IMPACT}}</w:t>
+              <w:t>{IMPACT}</w:t>
             </w:r>
           </w:p>
         </w:tc>
@@ -19794,7 +19794,7 @@
                 <w:sz w:val="14"/>
                 <w:highlight w:val="yellow"/>
               </w:rPr>
-              <w:t>{{OWNER}}</w:t>
+              <w:t>{OWNER}</w:t>
             </w:r>
           </w:p>
         </w:tc>
@@ -19828,7 +19828,7 @@
                 <w:sz w:val="14"/>
                 <w:highlight w:val="yellow"/>
               </w:rPr>
-              <w:t>{{TARGET_DATE}}</w:t>
+              <w:t>{TARGET_DATE}</w:t>
             </w:r>
           </w:p>
         </w:tc>
@@ -19862,7 +19862,7 @@
                 <w:sz w:val="14"/>
                 <w:highlight w:val="yellow"/>
               </w:rPr>
-              <w:t>{{STATUS}}</w:t>
+              <w:t>{STATUS}</w:t>
             </w:r>
           </w:p>
         </w:tc>
@@ -19897,7 +19897,7 @@
                 <w:sz w:val="14"/>
                 <w:highlight w:val="yellow"/>
               </w:rPr>
-              <w:t>{{EXCEPTION_ID_2}}</w:t>
+              <w:t>{EXCEPTION_ID_2}</w:t>
             </w:r>
           </w:p>
         </w:tc>
@@ -19930,7 +19930,7 @@
                 <w:sz w:val="14"/>
                 <w:highlight w:val="yellow"/>
               </w:rPr>
-              <w:t>{{AREA}}</w:t>
+              <w:t>{AREA}</w:t>
             </w:r>
           </w:p>
         </w:tc>
@@ -19963,7 +19963,7 @@
                 <w:sz w:val="14"/>
                 <w:highlight w:val="yellow"/>
               </w:rPr>
-              <w:t>{{DESCRIPTION}}</w:t>
+              <w:t>{DESCRIPTION}</w:t>
             </w:r>
           </w:p>
         </w:tc>
@@ -19996,7 +19996,7 @@
                 <w:sz w:val="14"/>
                 <w:highlight w:val="yellow"/>
               </w:rPr>
-              <w:t>{{IMPACT}}</w:t>
+              <w:t>{IMPACT}</w:t>
             </w:r>
           </w:p>
         </w:tc>
@@ -20029,7 +20029,7 @@
                 <w:sz w:val="14"/>
                 <w:highlight w:val="yellow"/>
               </w:rPr>
-              <w:t>{{OWNER}}</w:t>
+              <w:t>{OWNER}</w:t>
             </w:r>
           </w:p>
         </w:tc>
@@ -20062,7 +20062,7 @@
                 <w:sz w:val="14"/>
                 <w:highlight w:val="yellow"/>
               </w:rPr>
-              <w:t>{{TARGET_DATE}}</w:t>
+              <w:t>{TARGET_DATE}</w:t>
             </w:r>
           </w:p>
         </w:tc>
@@ -20095,7 +20095,7 @@
                 <w:sz w:val="14"/>
                 <w:highlight w:val="yellow"/>
               </w:rPr>
-              <w:t>{{STATUS}}</w:t>
+              <w:t>{STATUS}</w:t>
             </w:r>
           </w:p>
         </w:tc>
@@ -20131,7 +20131,7 @@
                 <w:sz w:val="14"/>
                 <w:highlight w:val="yellow"/>
               </w:rPr>
-              <w:t>{{EXCEPTION_ID_3}}</w:t>
+              <w:t>{EXCEPTION_ID_3}</w:t>
             </w:r>
           </w:p>
         </w:tc>
@@ -20165,7 +20165,7 @@
                 <w:sz w:val="14"/>
                 <w:highlight w:val="yellow"/>
               </w:rPr>
-              <w:t>{{AREA}}</w:t>
+              <w:t>{AREA}</w:t>
             </w:r>
           </w:p>
         </w:tc>
@@ -20199,7 +20199,7 @@
                 <w:sz w:val="14"/>
                 <w:highlight w:val="yellow"/>
               </w:rPr>
-              <w:t>{{DESCRIPTION}}</w:t>
+              <w:t>{DESCRIPTION}</w:t>
             </w:r>
           </w:p>
         </w:tc>
@@ -20233,7 +20233,7 @@
                 <w:sz w:val="14"/>
                 <w:highlight w:val="yellow"/>
               </w:rPr>
-              <w:t>{{IMPACT}}</w:t>
+              <w:t>{IMPACT}</w:t>
             </w:r>
           </w:p>
         </w:tc>
@@ -20267,7 +20267,7 @@
                 <w:sz w:val="14"/>
                 <w:highlight w:val="yellow"/>
               </w:rPr>
-              <w:t>{{OWNER}}</w:t>
+              <w:t>{OWNER}</w:t>
             </w:r>
           </w:p>
         </w:tc>
@@ -20301,7 +20301,7 @@
                 <w:sz w:val="14"/>
                 <w:highlight w:val="yellow"/>
               </w:rPr>
-              <w:t>{{TARGET_DATE}}</w:t>
+              <w:t>{TARGET_DATE}</w:t>
             </w:r>
           </w:p>
         </w:tc>
@@ -20335,7 +20335,7 @@
                 <w:sz w:val="14"/>
                 <w:highlight w:val="yellow"/>
               </w:rPr>
-              <w:t>{{STATUS}}</w:t>
+              <w:t>{STATUS}</w:t>
             </w:r>
           </w:p>
         </w:tc>
@@ -20741,7 +20741,7 @@
                 <w:sz w:val="14"/>
                 <w:highlight w:val="yellow"/>
               </w:rPr>
-              <w:t>{{FILE_REF}}</w:t>
+              <w:t>{FILE_REF}</w:t>
             </w:r>
           </w:p>
         </w:tc>
@@ -20775,7 +20775,7 @@
                 <w:sz w:val="14"/>
                 <w:highlight w:val="yellow"/>
               </w:rPr>
-              <w:t>{{NAME}}</w:t>
+              <w:t>{NAME}</w:t>
             </w:r>
           </w:p>
         </w:tc>
@@ -20809,7 +20809,7 @@
                 <w:sz w:val="14"/>
                 <w:highlight w:val="yellow"/>
               </w:rPr>
-              <w:t>{{NAME}}</w:t>
+              <w:t>{NAME}</w:t>
             </w:r>
           </w:p>
         </w:tc>
@@ -20843,7 +20843,7 @@
                 <w:sz w:val="14"/>
                 <w:highlight w:val="yellow"/>
               </w:rPr>
-              <w:t>{{STATUS}}</w:t>
+              <w:t>{STATUS}</w:t>
             </w:r>
           </w:p>
         </w:tc>
@@ -20944,7 +20944,7 @@
                 <w:sz w:val="14"/>
                 <w:highlight w:val="yellow"/>
               </w:rPr>
-              <w:t>{{FILE_REF}}</w:t>
+              <w:t>{FILE_REF}</w:t>
             </w:r>
           </w:p>
         </w:tc>
@@ -20977,7 +20977,7 @@
                 <w:sz w:val="14"/>
                 <w:highlight w:val="yellow"/>
               </w:rPr>
-              <w:t>{{NAME}}</w:t>
+              <w:t>{NAME}</w:t>
             </w:r>
           </w:p>
         </w:tc>
@@ -21010,7 +21010,7 @@
                 <w:sz w:val="14"/>
                 <w:highlight w:val="yellow"/>
               </w:rPr>
-              <w:t>{{NAME}}</w:t>
+              <w:t>{NAME}</w:t>
             </w:r>
           </w:p>
         </w:tc>
@@ -21043,7 +21043,7 @@
                 <w:sz w:val="14"/>
                 <w:highlight w:val="yellow"/>
               </w:rPr>
-              <w:t>{{STATUS}}</w:t>
+              <w:t>{STATUS}</w:t>
             </w:r>
           </w:p>
         </w:tc>
@@ -21147,7 +21147,7 @@
                 <w:sz w:val="14"/>
                 <w:highlight w:val="yellow"/>
               </w:rPr>
-              <w:t>{{FILE_REF}}</w:t>
+              <w:t>{FILE_REF}</w:t>
             </w:r>
           </w:p>
         </w:tc>
@@ -21181,7 +21181,7 @@
                 <w:sz w:val="14"/>
                 <w:highlight w:val="yellow"/>
               </w:rPr>
-              <w:t>{{NAME}}</w:t>
+              <w:t>{NAME}</w:t>
             </w:r>
           </w:p>
         </w:tc>
@@ -21215,7 +21215,7 @@
                 <w:sz w:val="14"/>
                 <w:highlight w:val="yellow"/>
               </w:rPr>
-              <w:t>{{NAME}}</w:t>
+              <w:t>{NAME}</w:t>
             </w:r>
           </w:p>
         </w:tc>
@@ -21249,7 +21249,7 @@
                 <w:sz w:val="14"/>
                 <w:highlight w:val="yellow"/>
               </w:rPr>
-              <w:t>{{STATUS}}</w:t>
+              <w:t>{STATUS}</w:t>
             </w:r>
           </w:p>
         </w:tc>
@@ -21350,7 +21350,7 @@
                 <w:sz w:val="14"/>
                 <w:highlight w:val="yellow"/>
               </w:rPr>
-              <w:t>{{FILE_REF}}</w:t>
+              <w:t>{FILE_REF}</w:t>
             </w:r>
           </w:p>
         </w:tc>
@@ -21383,7 +21383,7 @@
                 <w:sz w:val="14"/>
                 <w:highlight w:val="yellow"/>
               </w:rPr>
-              <w:t>{{NAME}}</w:t>
+              <w:t>{NAME}</w:t>
             </w:r>
           </w:p>
         </w:tc>
@@ -21416,7 +21416,7 @@
                 <w:sz w:val="14"/>
                 <w:highlight w:val="yellow"/>
               </w:rPr>
-              <w:t>{{NAME}}</w:t>
+              <w:t>{NAME}</w:t>
             </w:r>
           </w:p>
         </w:tc>
@@ -21449,7 +21449,7 @@
                 <w:sz w:val="14"/>
                 <w:highlight w:val="yellow"/>
               </w:rPr>
-              <w:t>{{STATUS}}</w:t>
+              <w:t>{STATUS}</w:t>
             </w:r>
           </w:p>
         </w:tc>
@@ -21553,7 +21553,7 @@
                 <w:sz w:val="14"/>
                 <w:highlight w:val="yellow"/>
               </w:rPr>
-              <w:t>{{FILE_REF}}</w:t>
+              <w:t>{FILE_REF}</w:t>
             </w:r>
           </w:p>
         </w:tc>
@@ -21587,7 +21587,7 @@
                 <w:sz w:val="14"/>
                 <w:highlight w:val="yellow"/>
               </w:rPr>
-              <w:t>{{NAME}}</w:t>
+              <w:t>{NAME}</w:t>
             </w:r>
           </w:p>
         </w:tc>
@@ -21621,7 +21621,7 @@
                 <w:sz w:val="14"/>
                 <w:highlight w:val="yellow"/>
               </w:rPr>
-              <w:t>{{NAME}}</w:t>
+              <w:t>{NAME}</w:t>
             </w:r>
           </w:p>
         </w:tc>
@@ -21655,7 +21655,7 @@
                 <w:sz w:val="14"/>
                 <w:highlight w:val="yellow"/>
               </w:rPr>
-              <w:t>{{STATUS}}</w:t>
+              <w:t>{STATUS}</w:t>
             </w:r>
           </w:p>
         </w:tc>
@@ -21756,7 +21756,7 @@
                 <w:sz w:val="14"/>
                 <w:highlight w:val="yellow"/>
               </w:rPr>
-              <w:t>{{FILE_REF}}</w:t>
+              <w:t>{FILE_REF}</w:t>
             </w:r>
           </w:p>
         </w:tc>
@@ -21789,7 +21789,7 @@
                 <w:sz w:val="14"/>
                 <w:highlight w:val="yellow"/>
               </w:rPr>
-              <w:t>{{NAME}}</w:t>
+              <w:t>{NAME}</w:t>
             </w:r>
           </w:p>
         </w:tc>
@@ -21822,7 +21822,7 @@
                 <w:sz w:val="14"/>
                 <w:highlight w:val="yellow"/>
               </w:rPr>
-              <w:t>{{NAME}}</w:t>
+              <w:t>{NAME}</w:t>
             </w:r>
           </w:p>
         </w:tc>
@@ -21855,7 +21855,7 @@
                 <w:sz w:val="14"/>
                 <w:highlight w:val="yellow"/>
               </w:rPr>
-              <w:t>{{STATUS}}</w:t>
+              <w:t>{STATUS}</w:t>
             </w:r>
           </w:p>
         </w:tc>
@@ -21959,7 +21959,7 @@
                 <w:sz w:val="14"/>
                 <w:highlight w:val="yellow"/>
               </w:rPr>
-              <w:t>{{FILE_REF}}</w:t>
+              <w:t>{FILE_REF}</w:t>
             </w:r>
           </w:p>
         </w:tc>
@@ -21993,7 +21993,7 @@
                 <w:sz w:val="14"/>
                 <w:highlight w:val="yellow"/>
               </w:rPr>
-              <w:t>{{NAME}}</w:t>
+              <w:t>{NAME}</w:t>
             </w:r>
           </w:p>
         </w:tc>
@@ -22027,7 +22027,7 @@
                 <w:sz w:val="14"/>
                 <w:highlight w:val="yellow"/>
               </w:rPr>
-              <w:t>{{NAME}}</w:t>
+              <w:t>{NAME}</w:t>
             </w:r>
           </w:p>
         </w:tc>
@@ -22061,7 +22061,7 @@
                 <w:sz w:val="14"/>
                 <w:highlight w:val="yellow"/>
               </w:rPr>
-              <w:t>{{STATUS}}</w:t>
+              <w:t>{STATUS}</w:t>
             </w:r>
           </w:p>
         </w:tc>
@@ -22162,7 +22162,7 @@
                 <w:sz w:val="14"/>
                 <w:highlight w:val="yellow"/>
               </w:rPr>
-              <w:t>{{FILE_REF}}</w:t>
+              <w:t>{FILE_REF}</w:t>
             </w:r>
           </w:p>
         </w:tc>
@@ -22195,7 +22195,7 @@
                 <w:sz w:val="14"/>
                 <w:highlight w:val="yellow"/>
               </w:rPr>
-              <w:t>{{NAME}}</w:t>
+              <w:t>{NAME}</w:t>
             </w:r>
           </w:p>
         </w:tc>
@@ -22228,7 +22228,7 @@
                 <w:sz w:val="14"/>
                 <w:highlight w:val="yellow"/>
               </w:rPr>
-              <w:t>{{NAME}}</w:t>
+              <w:t>{NAME}</w:t>
             </w:r>
           </w:p>
         </w:tc>
@@ -22261,7 +22261,7 @@
                 <w:sz w:val="14"/>
                 <w:highlight w:val="yellow"/>
               </w:rPr>
-              <w:t>{{STATUS}}</w:t>
+              <w:t>{STATUS}</w:t>
             </w:r>
           </w:p>
         </w:tc>
@@ -22365,7 +22365,7 @@
                 <w:sz w:val="14"/>
                 <w:highlight w:val="yellow"/>
               </w:rPr>
-              <w:t>{{FILE_REF}}</w:t>
+              <w:t>{FILE_REF}</w:t>
             </w:r>
           </w:p>
         </w:tc>
@@ -22399,7 +22399,7 @@
                 <w:sz w:val="14"/>
                 <w:highlight w:val="yellow"/>
               </w:rPr>
-              <w:t>{{NAME}}</w:t>
+              <w:t>{NAME}</w:t>
             </w:r>
           </w:p>
         </w:tc>
@@ -22433,7 +22433,7 @@
                 <w:sz w:val="14"/>
                 <w:highlight w:val="yellow"/>
               </w:rPr>
-              <w:t>{{NAME}}</w:t>
+              <w:t>{NAME}</w:t>
             </w:r>
           </w:p>
         </w:tc>
@@ -22467,7 +22467,7 @@
                 <w:sz w:val="14"/>
                 <w:highlight w:val="yellow"/>
               </w:rPr>
-              <w:t>{{STATUS}}</w:t>
+              <w:t>{STATUS}</w:t>
             </w:r>
           </w:p>
         </w:tc>
@@ -22762,7 +22762,7 @@
                 <w:sz w:val="15"/>
                 <w:highlight w:val="yellow"/>
               </w:rPr>
-              <w:t>{{PREPARER_NAME}}</w:t>
+              <w:t>{PREPARER_NAME}</w:t>
             </w:r>
           </w:p>
         </w:tc>
@@ -22796,7 +22796,7 @@
                 <w:sz w:val="15"/>
                 <w:highlight w:val="yellow"/>
               </w:rPr>
-              <w:t>{{PREPARER_DESIGNATION}}</w:t>
+              <w:t>{PREPARER_DESIGNATION}</w:t>
             </w:r>
           </w:p>
         </w:tc>
@@ -22830,7 +22830,7 @@
                 <w:sz w:val="15"/>
                 <w:highlight w:val="yellow"/>
               </w:rPr>
-              <w:t>{{PREPARATION_DATE}}</w:t>
+              <w:t>{PREPARATION_DATE}</w:t>
             </w:r>
           </w:p>
         </w:tc>
@@ -22864,7 +22864,7 @@
                 <w:sz w:val="15"/>
                 <w:highlight w:val="yellow"/>
               </w:rPr>
-              <w:t>{{SIGNATURE_OR_DIGITAL_APPROVAL}}</w:t>
+              <w:t>{SIGNATURE_OR_DIGITAL_APPROVAL}</w:t>
             </w:r>
           </w:p>
         </w:tc>
@@ -22932,7 +22932,7 @@
                 <w:sz w:val="15"/>
                 <w:highlight w:val="yellow"/>
               </w:rPr>
-              <w:t>{{FINANCE_REVIEWER_NAME}}</w:t>
+              <w:t>{FINANCE_REVIEWER_NAME}</w:t>
             </w:r>
           </w:p>
         </w:tc>
@@ -22965,7 +22965,7 @@
                 <w:sz w:val="15"/>
                 <w:highlight w:val="yellow"/>
               </w:rPr>
-              <w:t>{{FINANCE_REVIEWER_DESIGNATION}}</w:t>
+              <w:t>{FINANCE_REVIEWER_DESIGNATION}</w:t>
             </w:r>
           </w:p>
         </w:tc>
@@ -22998,7 +22998,7 @@
                 <w:sz w:val="15"/>
                 <w:highlight w:val="yellow"/>
               </w:rPr>
-              <w:t>{{REVIEW_DATE}}</w:t>
+              <w:t>{REVIEW_DATE}</w:t>
             </w:r>
           </w:p>
         </w:tc>
@@ -23031,7 +23031,7 @@
                 <w:sz w:val="15"/>
                 <w:highlight w:val="yellow"/>
               </w:rPr>
-              <w:t>{{SIGNATURE_OR_DIGITAL_APPROVAL}}</w:t>
+              <w:t>{SIGNATURE_OR_DIGITAL_APPROVAL}</w:t>
             </w:r>
           </w:p>
         </w:tc>
@@ -23101,7 +23101,7 @@
                 <w:sz w:val="15"/>
                 <w:highlight w:val="yellow"/>
               </w:rPr>
-              <w:t>{{COMPLIANCE_OFFICER_NAME}}</w:t>
+              <w:t>{COMPLIANCE_OFFICER_NAME}</w:t>
             </w:r>
           </w:p>
         </w:tc>
@@ -23135,7 +23135,7 @@
                 <w:sz w:val="15"/>
                 <w:highlight w:val="yellow"/>
               </w:rPr>
-              <w:t>{{COMPLIANCE_OFFICER_DESIGNATION}}</w:t>
+              <w:t>{COMPLIANCE_OFFICER_DESIGNATION}</w:t>
             </w:r>
           </w:p>
         </w:tc>
@@ -23169,7 +23169,7 @@
                 <w:sz w:val="15"/>
                 <w:highlight w:val="yellow"/>
               </w:rPr>
-              <w:t>{{REVIEW_DATE}}</w:t>
+              <w:t>{REVIEW_DATE}</w:t>
             </w:r>
           </w:p>
         </w:tc>
@@ -23203,7 +23203,7 @@
                 <w:sz w:val="15"/>
                 <w:highlight w:val="yellow"/>
               </w:rPr>
-              <w:t>{{SIGNATURE_OR_DIGITAL_APPROVAL}}</w:t>
+              <w:t>{SIGNATURE_OR_DIGITAL_APPROVAL}</w:t>
             </w:r>
           </w:p>
         </w:tc>
@@ -23271,7 +23271,7 @@
                 <w:sz w:val="15"/>
                 <w:highlight w:val="yellow"/>
               </w:rPr>
-              <w:t>{{AUTHORISED_OFFICER_NAME}}</w:t>
+              <w:t>{AUTHORISED_OFFICER_NAME}</w:t>
             </w:r>
           </w:p>
         </w:tc>
@@ -23304,7 +23304,7 @@
                 <w:sz w:val="15"/>
                 <w:highlight w:val="yellow"/>
               </w:rPr>
-              <w:t>{{AUTHORISED_OFFICER_DESIGNATION}}</w:t>
+              <w:t>{AUTHORISED_OFFICER_DESIGNATION}</w:t>
             </w:r>
           </w:p>
         </w:tc>
@@ -23337,7 +23337,7 @@
                 <w:sz w:val="15"/>
                 <w:highlight w:val="yellow"/>
               </w:rPr>
-              <w:t>{{APPROVAL_DATE}}</w:t>
+              <w:t>{APPROVAL_DATE}</w:t>
             </w:r>
           </w:p>
         </w:tc>
@@ -23370,7 +23370,7 @@
                 <w:sz w:val="15"/>
                 <w:highlight w:val="yellow"/>
               </w:rPr>
-              <w:t>{{SIGNATURE_OR_DIGITAL_APPROVAL}}</w:t>
+              <w:t>{SIGNATURE_OR_DIGITAL_APPROVAL}</w:t>
             </w:r>
           </w:p>
         </w:tc>
@@ -23542,7 +23542,7 @@
                 <w:sz w:val="15"/>
                 <w:highlight w:val="yellow"/>
               </w:rPr>
-              <w:t>{{REPORTING_RUN_ID}}</w:t>
+              <w:t>{REPORTING_RUN_ID}</w:t>
             </w:r>
           </w:p>
         </w:tc>
@@ -23610,7 +23610,7 @@
                 <w:sz w:val="15"/>
                 <w:highlight w:val="yellow"/>
               </w:rPr>
-              <w:t>{{GENERATED_REPORT_ID}}</w:t>
+              <w:t>{GENERATED_REPORT_ID}</w:t>
             </w:r>
           </w:p>
         </w:tc>
@@ -23680,7 +23680,7 @@
                 <w:sz w:val="15"/>
                 <w:highlight w:val="yellow"/>
               </w:rPr>
-              <w:t>{{SOURCE_DATA_SNAPSHOT_ID}}</w:t>
+              <w:t>{SOURCE_DATA_SNAPSHOT_ID}</w:t>
             </w:r>
           </w:p>
         </w:tc>
@@ -23748,7 +23748,7 @@
                 <w:sz w:val="15"/>
                 <w:highlight w:val="yellow"/>
               </w:rPr>
-              <w:t>{{GENERATED_BY_USER}}</w:t>
+              <w:t>{GENERATED_BY_USER}</w:t>
             </w:r>
           </w:p>
         </w:tc>
@@ -23818,7 +23818,7 @@
                 <w:sz w:val="15"/>
                 <w:highlight w:val="yellow"/>
               </w:rPr>
-              <w:t>{{GENERATED_DATETIME}}</w:t>
+              <w:t>{GENERATED_DATETIME}</w:t>
             </w:r>
           </w:p>
         </w:tc>
@@ -23886,7 +23886,7 @@
                 <w:sz w:val="15"/>
                 <w:highlight w:val="yellow"/>
               </w:rPr>
-              <w:t>{{CHECKER_APPROVAL_DATETIME}}</w:t>
+              <w:t>{CHECKER_APPROVAL_DATETIME}</w:t>
             </w:r>
           </w:p>
         </w:tc>
@@ -23956,7 +23956,7 @@
                 <w:sz w:val="15"/>
                 <w:highlight w:val="yellow"/>
               </w:rPr>
-              <w:t>{{EMAIL_PORTAL_MANUAL_DELIVERY_OTHER}}</w:t>
+              <w:t>{EMAIL_PORTAL_MANUAL_DELIVERY_OTHER}</w:t>
             </w:r>
           </w:p>
         </w:tc>
@@ -24024,7 +24024,7 @@
                 <w:sz w:val="15"/>
                 <w:highlight w:val="yellow"/>
               </w:rPr>
-              <w:t>{{SECZIM_SUBMISSION_REFERENCE}}</w:t>
+              <w:t>{SECZIM_SUBMISSION_REFERENCE}</w:t>
             </w:r>
           </w:p>
         </w:tc>
@@ -24094,7 +24094,7 @@
                 <w:sz w:val="15"/>
                 <w:highlight w:val="yellow"/>
               </w:rPr>
-              <w:t>{{SUBMISSION_RECEIPT_FILE_REF}}</w:t>
+              <w:t>{SUBMISSION_RECEIPT_FILE_REF}</w:t>
             </w:r>
           </w:p>
         </w:tc>
@@ -24162,7 +24162,7 @@
                 <w:sz w:val="15"/>
                 <w:highlight w:val="yellow"/>
               </w:rPr>
-              <w:t>{{SECZIM_QUERY_REFERENCE}}</w:t>
+              <w:t>{SECZIM_QUERY_REFERENCE}</w:t>
             </w:r>
           </w:p>
         </w:tc>
@@ -24232,7 +24232,7 @@
                 <w:sz w:val="15"/>
                 <w:highlight w:val="yellow"/>
               </w:rPr>
-              <w:t>{{CLOSURE_ACCEPTANCE_DATE}}</w:t>
+              <w:t>{CLOSURE_ACCEPTANCE_DATE}</w:t>
             </w:r>
           </w:p>
         </w:tc>
@@ -24300,7 +24300,7 @@
                 <w:sz w:val="15"/>
                 <w:highlight w:val="yellow"/>
               </w:rPr>
-              <w:t>{{DOCUMENT_HASH}}</w:t>
+              <w:t>{DOCUMENT_HASH}</w:t>
             </w:r>
           </w:p>
         </w:tc>
@@ -24370,7 +24370,7 @@
                 <w:sz w:val="15"/>
                 <w:highlight w:val="yellow"/>
               </w:rPr>
-              <w:t>{{DRAFT_LOCKED_ARCHIVED}}</w:t>
+              <w:t>{DRAFT_LOCKED_ARCHIVED}</w:t>
             </w:r>
           </w:p>
         </w:tc>
@@ -24398,7 +24398,7 @@
           <w:color w:val="526173"/>
           <w:sz w:val="16"/>
         </w:rPr>
-        <w:t>Confidential Regulatory Support Pack | {{LICENSED_ENTITY_NAME}} | {{REPORTING_PERIOD}} | Generated from approved Arcus source data | Valid only with approval record and checksum.</w:t>
+        <w:t>Confidential Regulatory Support Pack | {LICENSED_ENTITY_NAME} | {REPORTING_PERIOD} | Generated from approved Arcus source data | Valid only with approval record and checksum.</w:t>
       </w:r>
     </w:p>
     <w:sectPr>

</xml_diff>